<commit_message>
Version update to protocol
</commit_message>
<xml_diff>
--- a/analysis protocol.docx
+++ b/analysis protocol.docx
@@ -1045,15 +1045,7 @@
           <w:szCs w:val="24"/>
           <w:lang w:val="en-US"/>
         </w:rPr>
-        <w:t xml:space="preserve"> </w:t>
-      </w:r>
-      <w:r>
-        <w:rPr>
-          <w:sz w:val="24"/>
-          <w:szCs w:val="24"/>
-          <w:lang w:val="en-US"/>
-        </w:rPr>
-        <w:t xml:space="preserve">World-wide norm population, Norwegian </w:t>
+        <w:t xml:space="preserve"> World-wide norm population, Norwegian </w:t>
       </w:r>
       <w:proofErr w:type="spellStart"/>
       <w:r>
@@ -1128,21 +1120,7 @@
         <w:rPr>
           <w:lang w:val="en-US"/>
         </w:rPr>
-        <w:t xml:space="preserve">Pros: 19 000+ responses from </w:t>
-      </w:r>
-      <w:proofErr w:type="gramStart"/>
-      <w:r>
-        <w:rPr>
-          <w:lang w:val="en-US"/>
-        </w:rPr>
-        <w:t>all across</w:t>
-      </w:r>
-      <w:proofErr w:type="gramEnd"/>
-      <w:r>
-        <w:rPr>
-          <w:lang w:val="en-US"/>
-        </w:rPr>
-        <w:t xml:space="preserve"> the world, the raw data is available, allowing item-to-item comparisons, and opens the ability to check distributions before a potential t-test, ANOVA or linear interpolation. Can also report characteristics like age, gender and </w:t>
+        <w:t xml:space="preserve">Pros: 19 000+ responses from all across the world, the raw data is available, allowing item-to-item comparisons, and opens the ability to check distributions before a potential t-test, ANOVA or linear interpolation. Can also report characteristics like age, gender and </w:t>
       </w:r>
       <w:proofErr w:type="spellStart"/>
       <w:r>
@@ -1320,7 +1298,6 @@
         </w:rPr>
         <w:t xml:space="preserve">Pros: </w:t>
       </w:r>
-      <w:proofErr w:type="gramStart"/>
       <w:r>
         <w:rPr>
           <w:sz w:val="28"/>
@@ -1345,14 +1322,7 @@
         <w:rPr>
           <w:lang w:val="en-US"/>
         </w:rPr>
-        <w:t>,</w:t>
-      </w:r>
-      <w:proofErr w:type="gramEnd"/>
-      <w:r>
-        <w:rPr>
-          <w:lang w:val="en-US"/>
-        </w:rPr>
-        <w:t xml:space="preserve"> has used the same </w:t>
+        <w:t xml:space="preserve">, has used the same </w:t>
       </w:r>
       <w:r>
         <w:rPr>
@@ -1944,21 +1914,7 @@
         <w:rPr>
           <w:lang w:val="en-US"/>
         </w:rPr>
-        <w:t xml:space="preserve"> this is based </w:t>
-      </w:r>
-      <w:proofErr w:type="gramStart"/>
-      <w:r>
-        <w:rPr>
-          <w:lang w:val="en-US"/>
-        </w:rPr>
-        <w:t>off of</w:t>
-      </w:r>
-      <w:proofErr w:type="gramEnd"/>
-      <w:r>
-        <w:rPr>
-          <w:lang w:val="en-US"/>
-        </w:rPr>
-        <w:t xml:space="preserve"> a larger study, but I couldn’t find it </w:t>
+        <w:t xml:space="preserve"> this is based off of a larger study, but I couldn’t find it </w:t>
       </w:r>
       <w:r>
         <w:rPr>
@@ -2338,21 +2294,7 @@
         <w:rPr>
           <w:lang w:val="en-US"/>
         </w:rPr>
-        <w:t xml:space="preserve">44-item </w:t>
-      </w:r>
-      <w:proofErr w:type="gramStart"/>
-      <w:r>
-        <w:rPr>
-          <w:lang w:val="en-US"/>
-        </w:rPr>
-        <w:t>version, but</w:t>
-      </w:r>
-      <w:proofErr w:type="gramEnd"/>
-      <w:r>
-        <w:rPr>
-          <w:lang w:val="en-US"/>
-        </w:rPr>
-        <w:t xml:space="preserve"> summed the subscales rather than averaged them (</w:t>
+        <w:t>44-item version, but summed the subscales rather than averaged them (</w:t>
       </w:r>
       <w:proofErr w:type="spellStart"/>
       <w:r>
@@ -2652,27 +2594,13 @@
         <w:rPr>
           <w:lang w:val="en-US"/>
         </w:rPr>
-        <w:t xml:space="preserve">Pros: </w:t>
-      </w:r>
-      <w:proofErr w:type="gramStart"/>
-      <w:r>
-        <w:rPr>
-          <w:lang w:val="en-US"/>
-        </w:rPr>
-        <w:t>Spread across Norway</w:t>
-      </w:r>
-      <w:r>
-        <w:rPr>
-          <w:lang w:val="en-US"/>
-        </w:rPr>
-        <w:t>,</w:t>
-      </w:r>
-      <w:proofErr w:type="gramEnd"/>
-      <w:r>
-        <w:rPr>
-          <w:lang w:val="en-US"/>
-        </w:rPr>
-        <w:t xml:space="preserve"> has mapped all he combinations for E/I, N/</w:t>
+        <w:t>Pros: Spread across Norway</w:t>
+      </w:r>
+      <w:r>
+        <w:rPr>
+          <w:lang w:val="en-US"/>
+        </w:rPr>
+        <w:t>, has mapped all he combinations for E/I, N/</w:t>
       </w:r>
       <w:r>
         <w:rPr>
@@ -2874,6 +2802,151 @@
         </w:rPr>
         <w:t xml:space="preserve"> year and had already met patients etc.</w:t>
       </w:r>
+    </w:p>
+    <w:p>
+      <w:pPr>
+        <w:rPr>
+          <w:lang w:val="en-US"/>
+        </w:rPr>
+      </w:pPr>
+    </w:p>
+    <w:p>
+      <w:pPr>
+        <w:pStyle w:val="Heading2"/>
+      </w:pPr>
+      <w:r>
+        <w:t>Version updates</w:t>
+      </w:r>
+    </w:p>
+    <w:p>
+      <w:pPr>
+        <w:rPr>
+          <w:lang w:val="en-US"/>
+        </w:rPr>
+      </w:pPr>
+      <w:r>
+        <w:rPr>
+          <w:lang w:val="en-US"/>
+        </w:rPr>
+        <w:t xml:space="preserve">2025-10-10 Published the first version in GitHub, publicly available. </w:t>
+      </w:r>
+    </w:p>
+    <w:p>
+      <w:pPr>
+        <w:rPr>
+          <w:lang w:val="en-US"/>
+        </w:rPr>
+      </w:pPr>
+      <w:r>
+        <w:rPr>
+          <w:lang w:val="en-US"/>
+        </w:rPr>
+        <w:t xml:space="preserve">2025-16-10 </w:t>
+      </w:r>
+      <w:r>
+        <w:rPr>
+          <w:lang w:val="en-US"/>
+        </w:rPr>
+        <w:t xml:space="preserve">After publishing the protocol we discovered </w:t>
+      </w:r>
+      <w:r>
+        <w:rPr>
+          <w:lang w:val="en-US"/>
+        </w:rPr>
+        <w:t xml:space="preserve">a Norwegian Master’s Thesis with MBTI data on </w:t>
+      </w:r>
+      <w:r>
+        <w:rPr>
+          <w:lang w:val="en-US"/>
+        </w:rPr>
+        <w:t>308 Norwegian soldie</w:t>
+      </w:r>
+      <w:r>
+        <w:rPr>
+          <w:lang w:val="en-US"/>
+        </w:rPr>
+        <w:t>r</w:t>
+      </w:r>
+      <w:r>
+        <w:rPr>
+          <w:lang w:val="en-US"/>
+        </w:rPr>
+        <w:t xml:space="preserve">s, recruited from all over Norway. </w:t>
+      </w:r>
+    </w:p>
+    <w:p>
+      <w:pPr>
+        <w:rPr>
+          <w:lang w:val="en-US"/>
+        </w:rPr>
+      </w:pPr>
+      <w:hyperlink r:id="rId22" w:history="1">
+        <w:r>
+          <w:rPr>
+            <w:rStyle w:val="Hyperlink"/>
+          </w:rPr>
+          <w:t>ODA Open Digital Archive: Norske soldaters personlighetstype, ernæringskompetanse og treningsaktivitet – en pilotstudie</w:t>
+        </w:r>
+      </w:hyperlink>
+    </w:p>
+    <w:p>
+      <w:pPr>
+        <w:rPr>
+          <w:lang w:val="en-US"/>
+        </w:rPr>
+      </w:pPr>
+      <w:r>
+        <w:rPr>
+          <w:lang w:val="en-US"/>
+        </w:rPr>
+        <w:t>They had also reported down to the detail of 16 MBTI types, no</w:t>
+      </w:r>
+      <w:r>
+        <w:rPr>
+          <w:lang w:val="en-US"/>
+        </w:rPr>
+        <w:t>t</w:t>
+      </w:r>
+      <w:r>
+        <w:rPr>
+          <w:lang w:val="en-US"/>
+        </w:rPr>
+        <w:t xml:space="preserve"> just the 4 dichotomies. We decided to compare with these as well.</w:t>
+      </w:r>
+    </w:p>
+    <w:p>
+      <w:pPr>
+        <w:rPr>
+          <w:lang w:val="en-US"/>
+        </w:rPr>
+      </w:pPr>
+      <w:r>
+        <w:rPr>
+          <w:lang w:val="en-US"/>
+        </w:rPr>
+        <w:t xml:space="preserve">In addition, for psychometric properties, we found it fruitful to consider the correlation matrix of Big-5 items to understand reliability in addition to the </w:t>
+      </w:r>
+      <w:proofErr w:type="spellStart"/>
+      <w:r>
+        <w:rPr>
+          <w:lang w:val="en-US"/>
+        </w:rPr>
+        <w:t>Chronbach</w:t>
+      </w:r>
+      <w:proofErr w:type="spellEnd"/>
+      <w:r>
+        <w:rPr>
+          <w:lang w:val="en-US"/>
+        </w:rPr>
+        <w:t xml:space="preserve">-alpha. </w:t>
+      </w:r>
+    </w:p>
+    <w:p>
+      <w:pPr>
+        <w:rPr>
+          <w:lang w:val="en-US"/>
+        </w:rPr>
+      </w:pPr>
     </w:p>
     <w:p>
       <w:pPr>
@@ -4116,6 +4189,18 @@
       <w:shd w:val="clear" w:color="auto" w:fill="E1DFDD"/>
     </w:rPr>
   </w:style>
+  <w:style w:type="character" w:styleId="FollowedHyperlink">
+    <w:name w:val="FollowedHyperlink"/>
+    <w:basedOn w:val="DefaultParagraphFont"/>
+    <w:uiPriority w:val="99"/>
+    <w:semiHidden/>
+    <w:unhideWhenUsed/>
+    <w:rsid w:val="00C52656"/>
+    <w:rPr>
+      <w:color w:val="954F72" w:themeColor="followedHyperlink"/>
+      <w:u w:val="single"/>
+    </w:rPr>
+  </w:style>
 </w:styles>
 </file>
 
@@ -4426,15 +4511,6 @@
 </file>
 
 <file path=customXml/item2.xml><?xml version="1.0" encoding="utf-8"?>
-<?mso-contentType ?>
-<FormTemplates xmlns="http://schemas.microsoft.com/sharepoint/v3/contenttype/forms">
-  <Display>DocumentLibraryForm</Display>
-  <Edit>DocumentLibraryForm</Edit>
-  <New>DocumentLibraryForm</New>
-</FormTemplates>
-</file>
-
-<file path=customXml/item3.xml><?xml version="1.0" encoding="utf-8"?>
 <ct:contentTypeSchema xmlns:ct="http://schemas.microsoft.com/office/2006/metadata/contentType" xmlns:ma="http://schemas.microsoft.com/office/2006/metadata/properties/metaAttributes" ct:_="" ma:_="" ma:contentTypeName="Dokument" ma:contentTypeID="0x0101002FD2B189224EAB429D6E9D951C4B8706" ma:contentTypeVersion="10" ma:contentTypeDescription="Opprett et nytt dokument." ma:contentTypeScope="" ma:versionID="aa2411e86a6cea06c986399c3aac7408">
   <xsd:schema xmlns:xsd="http://www.w3.org/2001/XMLSchema" xmlns:xs="http://www.w3.org/2001/XMLSchema" xmlns:p="http://schemas.microsoft.com/office/2006/metadata/properties" xmlns:ns2="3dd1c965-52c6-4487-92af-739379b659ac" xmlns:ns3="e29f6279-0e28-4edd-8338-8230b9969525" targetNamespace="http://schemas.microsoft.com/office/2006/metadata/properties" ma:root="true" ma:fieldsID="accf30a8a610022cfee74474aabf405c" ns2:_="" ns3:_="">
     <xsd:import namespace="3dd1c965-52c6-4487-92af-739379b659ac"/>
@@ -4623,6 +4699,15 @@
 </ct:contentTypeSchema>
 </file>
 
+<file path=customXml/item3.xml><?xml version="1.0" encoding="utf-8"?>
+<?mso-contentType ?>
+<FormTemplates xmlns="http://schemas.microsoft.com/sharepoint/v3/contenttype/forms">
+  <Display>DocumentLibraryForm</Display>
+  <Edit>DocumentLibraryForm</Edit>
+  <New>DocumentLibraryForm</New>
+</FormTemplates>
+</file>
+
 <file path=customXml/itemProps1.xml><?xml version="1.0" encoding="utf-8"?>
 <ds:datastoreItem xmlns:ds="http://schemas.openxmlformats.org/officeDocument/2006/customXml" ds:itemID="{BBEB0EAC-C44A-4C2E-BCBF-069930B6BCF6}">
   <ds:schemaRefs>
@@ -4635,14 +4720,6 @@
 </file>
 
 <file path=customXml/itemProps2.xml><?xml version="1.0" encoding="utf-8"?>
-<ds:datastoreItem xmlns:ds="http://schemas.openxmlformats.org/officeDocument/2006/customXml" ds:itemID="{F4C647C5-8FE0-424A-94FD-C65D3CDA80F4}">
-  <ds:schemaRefs>
-    <ds:schemaRef ds:uri="http://schemas.microsoft.com/sharepoint/v3/contenttype/forms"/>
-  </ds:schemaRefs>
-</ds:datastoreItem>
-</file>
-
-<file path=customXml/itemProps3.xml><?xml version="1.0" encoding="utf-8"?>
 <ds:datastoreItem xmlns:ds="http://schemas.openxmlformats.org/officeDocument/2006/customXml" ds:itemID="{3F9A98A8-737A-4071-824A-DA67AF5AB367}">
   <ds:schemaRefs>
     <ds:schemaRef ds:uri="http://schemas.microsoft.com/office/2006/metadata/contentType"/>
@@ -4661,6 +4738,14 @@
 </ds:datastoreItem>
 </file>
 
+<file path=customXml/itemProps3.xml><?xml version="1.0" encoding="utf-8"?>
+<ds:datastoreItem xmlns:ds="http://schemas.openxmlformats.org/officeDocument/2006/customXml" ds:itemID="{F4C647C5-8FE0-424A-94FD-C65D3CDA80F4}">
+  <ds:schemaRefs>
+    <ds:schemaRef ds:uri="http://schemas.microsoft.com/sharepoint/v3/contenttype/forms"/>
+  </ds:schemaRefs>
+</ds:datastoreItem>
+</file>
+
 <file path=docMetadata/LabelInfo.xml><?xml version="1.0" encoding="utf-8"?>
 <clbl:labelList xmlns:clbl="http://schemas.microsoft.com/office/2020/mipLabelMetadata">
   <clbl:label id="{463b6811-b0a4-4b2a-b932-72c4c970c5d2}" enabled="0" method="" siteId="{463b6811-b0a4-4b2a-b932-72c4c970c5d2}" removed="1"/>

</xml_diff>

<commit_message>
Updated protocol after new data changes in 2026
</commit_message>
<xml_diff>
--- a/analysis protocol.docx
+++ b/analysis protocol.docx
@@ -133,14 +133,12 @@
         </w:rPr>
         <w:t xml:space="preserve">ntrovert in Big-5 </w:t>
       </w:r>
-      <w:proofErr w:type="spellStart"/>
-      <w:r>
-        <w:rPr>
-          <w:lang w:val="en-US"/>
-        </w:rPr>
-        <w:t>extrovertedness</w:t>
-      </w:r>
-      <w:proofErr w:type="spellEnd"/>
+      <w:r>
+        <w:rPr>
+          <w:lang w:val="en-US"/>
+        </w:rPr>
+        <w:t>extraversion</w:t>
+      </w:r>
     </w:p>
     <w:p>
       <w:pPr>
@@ -157,7 +155,37 @@
         <w:rPr>
           <w:lang w:val="en-US"/>
         </w:rPr>
-        <w:t>Test difference between MBTI Judging vs. Perceiving in Big-5 conscientiousness</w:t>
+        <w:t xml:space="preserve">Test difference between MBTI </w:t>
+      </w:r>
+      <w:r>
+        <w:rPr>
+          <w:lang w:val="en-US"/>
+        </w:rPr>
+        <w:t>Intuitive</w:t>
+      </w:r>
+      <w:r>
+        <w:rPr>
+          <w:lang w:val="en-US"/>
+        </w:rPr>
+        <w:t xml:space="preserve"> vs. </w:t>
+      </w:r>
+      <w:r>
+        <w:rPr>
+          <w:lang w:val="en-US"/>
+        </w:rPr>
+        <w:t>Observant</w:t>
+      </w:r>
+      <w:r>
+        <w:rPr>
+          <w:lang w:val="en-US"/>
+        </w:rPr>
+        <w:t xml:space="preserve"> in Big-5 </w:t>
+      </w:r>
+      <w:r>
+        <w:rPr>
+          <w:lang w:val="en-US"/>
+        </w:rPr>
+        <w:t>openness</w:t>
       </w:r>
     </w:p>
     <w:p>
@@ -175,7 +203,19 @@
         <w:rPr>
           <w:lang w:val="en-US"/>
         </w:rPr>
-        <w:t>Test difference between MBTI Thinking vs. Feeling in Big-5 agreeableness</w:t>
+        <w:t xml:space="preserve">Test difference between MBTI Judging vs. </w:t>
+      </w:r>
+      <w:r>
+        <w:rPr>
+          <w:lang w:val="en-US"/>
+        </w:rPr>
+        <w:t>Prospecting</w:t>
+      </w:r>
+      <w:r>
+        <w:rPr>
+          <w:lang w:val="en-US"/>
+        </w:rPr>
+        <w:t xml:space="preserve"> in Big-5 conscientiousness</w:t>
       </w:r>
     </w:p>
     <w:p>
@@ -193,7 +233,7 @@
         <w:rPr>
           <w:lang w:val="en-US"/>
         </w:rPr>
-        <w:t>See if any of these behave differently for age or gender (interaction)</w:t>
+        <w:t>Test difference between MBTI Thinking vs. Feeling in Big-5 agreeableness</w:t>
       </w:r>
     </w:p>
     <w:p>
@@ -211,6 +251,48 @@
         <w:rPr>
           <w:lang w:val="en-US"/>
         </w:rPr>
+        <w:t xml:space="preserve">Test difference between MBTI Assertive vs. Turbulent in Big-5 </w:t>
+      </w:r>
+      <w:r>
+        <w:rPr>
+          <w:lang w:val="en-US"/>
+        </w:rPr>
+        <w:t>neuroticism</w:t>
+      </w:r>
+    </w:p>
+    <w:p>
+      <w:pPr>
+        <w:pStyle w:val="ListParagraph"/>
+        <w:numPr>
+          <w:ilvl w:val="0"/>
+          <w:numId w:val="1"/>
+        </w:numPr>
+        <w:rPr>
+          <w:lang w:val="en-US"/>
+        </w:rPr>
+      </w:pPr>
+      <w:r>
+        <w:rPr>
+          <w:lang w:val="en-US"/>
+        </w:rPr>
+        <w:t>See if any of these behave differently for age or gender (interaction)</w:t>
+      </w:r>
+    </w:p>
+    <w:p>
+      <w:pPr>
+        <w:pStyle w:val="ListParagraph"/>
+        <w:numPr>
+          <w:ilvl w:val="0"/>
+          <w:numId w:val="1"/>
+        </w:numPr>
+        <w:rPr>
+          <w:lang w:val="en-US"/>
+        </w:rPr>
+      </w:pPr>
+      <w:r>
+        <w:rPr>
+          <w:lang w:val="en-US"/>
+        </w:rPr>
         <w:t xml:space="preserve">Exploratory factor analysis with all 16 personalities and </w:t>
       </w:r>
       <w:r>
@@ -224,6 +306,30 @@
           <w:lang w:val="en-US"/>
         </w:rPr>
         <w:t>Big-5 subscales</w:t>
+      </w:r>
+    </w:p>
+    <w:p>
+      <w:pPr>
+        <w:pStyle w:val="ListParagraph"/>
+        <w:numPr>
+          <w:ilvl w:val="0"/>
+          <w:numId w:val="1"/>
+        </w:numPr>
+        <w:rPr>
+          <w:lang w:val="en-US"/>
+        </w:rPr>
+      </w:pPr>
+      <w:r>
+        <w:rPr>
+          <w:lang w:val="en-US"/>
+        </w:rPr>
+        <w:t xml:space="preserve">Check distribution of MBTI dimensions for 2026, </w:t>
+      </w:r>
+      <w:r>
+        <w:rPr>
+          <w:lang w:val="en-US"/>
+        </w:rPr>
+        <w:t>which helps interpretation of the main analyses</w:t>
       </w:r>
     </w:p>
     <w:p>
@@ -489,20 +595,14 @@
         <w:rPr>
           <w:lang w:val="en-US"/>
         </w:rPr>
+        <w:lastRenderedPageBreak/>
         <w:t>Hypothesis testing can quickly lead to many p-values</w:t>
       </w:r>
       <w:r>
         <w:rPr>
           <w:lang w:val="en-US"/>
         </w:rPr>
-        <w:t>, with 5 big-5 subscale dimensions, 4 MBTI dimensions, and 4 cohorts to test against each other. We therefore choose to describe the time-</w:t>
-      </w:r>
-      <w:r>
-        <w:rPr>
-          <w:lang w:val="en-US"/>
-        </w:rPr>
-        <w:lastRenderedPageBreak/>
-        <w:t xml:space="preserve">trends with </w:t>
+        <w:t xml:space="preserve">, with 5 big-5 subscale dimensions, 4 MBTI dimensions, and 4 cohorts to test against each other. We therefore choose to describe the time-trends with </w:t>
       </w:r>
       <w:r>
         <w:rPr>
@@ -1120,7 +1220,14 @@
         <w:rPr>
           <w:lang w:val="en-US"/>
         </w:rPr>
-        <w:t xml:space="preserve">Pros: 19 000+ responses from all across the world, the raw data is available, allowing item-to-item comparisons, and opens the ability to check distributions before a potential t-test, ANOVA or linear interpolation. Can also report characteristics like age, gender and </w:t>
+        <w:t xml:space="preserve">Pros: 19 000+ responses from all across the world, the raw data is available, allowing item-to-item comparisons, and opens the ability to check distributions before a potential t-test, ANOVA or linear </w:t>
+      </w:r>
+      <w:r>
+        <w:rPr>
+          <w:lang w:val="en-US"/>
+        </w:rPr>
+        <w:lastRenderedPageBreak/>
+        <w:t xml:space="preserve">interpolation. Can also report characteristics like age, gender and </w:t>
       </w:r>
       <w:proofErr w:type="spellStart"/>
       <w:r>
@@ -1147,7 +1254,6 @@
         <w:rPr>
           <w:lang w:val="en-US"/>
         </w:rPr>
-        <w:lastRenderedPageBreak/>
         <w:t xml:space="preserve">Cons: They used a 5-point </w:t>
       </w:r>
       <w:proofErr w:type="spellStart"/>
@@ -1251,212 +1357,210 @@
         </w:rPr>
         <w:t>randomly drawn from the Norwegian population register and invited to participate in the Norwegian Life Course, Generation, and Gender Study (LOGG) (</w:t>
       </w:r>
+      <w:hyperlink r:id="rId12" w:anchor="bibr25-1029864917709519" w:history="1">
+        <w:r>
+          <w:rPr>
+            <w:rStyle w:val="Hyperlink"/>
+            <w:lang w:val="en-US"/>
+          </w:rPr>
+          <w:t>Lappegård &amp; Veenstra, 2010</w:t>
+        </w:r>
+      </w:hyperlink>
+      <w:r>
+        <w:rPr>
+          <w:lang w:val="en-US"/>
+        </w:rPr>
+        <w:t>).»</w:t>
+      </w:r>
+    </w:p>
+    <w:p>
+      <w:pPr>
+        <w:rPr>
+          <w:lang w:val="en-US"/>
+        </w:rPr>
+      </w:pPr>
+      <w:r>
+        <w:rPr>
+          <w:lang w:val="en-US"/>
+        </w:rPr>
+        <w:t xml:space="preserve">Pros: </w:t>
+      </w:r>
+      <w:r>
+        <w:rPr>
+          <w:lang w:val="en-US"/>
+        </w:rPr>
+        <w:t xml:space="preserve">Large </w:t>
+      </w:r>
+      <w:r>
+        <w:rPr>
+          <w:lang w:val="en-US"/>
+        </w:rPr>
+        <w:t>sample</w:t>
+      </w:r>
+      <w:r>
+        <w:rPr>
+          <w:lang w:val="en-US"/>
+        </w:rPr>
+        <w:t xml:space="preserve"> (n=6327)</w:t>
+      </w:r>
+      <w:r>
+        <w:rPr>
+          <w:lang w:val="en-US"/>
+        </w:rPr>
+        <w:t xml:space="preserve">, has used the same </w:t>
+      </w:r>
+      <w:r>
+        <w:rPr>
+          <w:lang w:val="en-US"/>
+        </w:rPr>
+        <w:t xml:space="preserve">Norwegian </w:t>
+      </w:r>
+      <w:r>
+        <w:rPr>
+          <w:lang w:val="en-US"/>
+        </w:rPr>
+        <w:t xml:space="preserve">BFI-20S tool. </w:t>
+      </w:r>
+      <w:r>
+        <w:rPr>
+          <w:lang w:val="en-US"/>
+        </w:rPr>
+        <w:t xml:space="preserve">Response rate </w:t>
+      </w:r>
+      <w:r>
+        <w:rPr>
+          <w:lang w:val="en-US"/>
+        </w:rPr>
+        <w:t>is not as bad as it could be</w:t>
+      </w:r>
+      <w:r>
+        <w:rPr>
+          <w:lang w:val="en-US"/>
+        </w:rPr>
+        <w:t xml:space="preserve">: 60% </w:t>
+      </w:r>
+      <w:r>
+        <w:rPr>
+          <w:lang w:val="en-US"/>
+        </w:rPr>
+        <w:t xml:space="preserve">of telephoned subjects </w:t>
+      </w:r>
+      <w:r>
+        <w:rPr>
+          <w:lang w:val="en-US"/>
+        </w:rPr>
+        <w:t>were interviewed, and 73% of interviewed subjects responded to the questionnaire</w:t>
+      </w:r>
+      <w:r>
+        <w:rPr>
+          <w:lang w:val="en-US"/>
+        </w:rPr>
+        <w:t>, then 58% of those were «workers»</w:t>
+      </w:r>
+      <w:r>
+        <w:rPr>
+          <w:lang w:val="en-US"/>
+        </w:rPr>
+        <w:t>.</w:t>
+      </w:r>
+      <w:r>
+        <w:rPr>
+          <w:lang w:val="en-US"/>
+        </w:rPr>
+        <w:t xml:space="preserve"> </w:t>
+      </w:r>
+      <w:r>
+        <w:br/>
+      </w:r>
+      <w:r>
+        <w:br/>
+      </w:r>
+      <w:r>
+        <w:rPr>
+          <w:lang w:val="en-US"/>
+        </w:rPr>
+        <w:t>Cons: Rather old sample</w:t>
+      </w:r>
+      <w:r>
+        <w:rPr>
+          <w:lang w:val="en-US"/>
+        </w:rPr>
+        <w:t xml:space="preserve"> (2007-2</w:t>
+      </w:r>
+      <w:r>
+        <w:rPr>
+          <w:lang w:val="en-US"/>
+        </w:rPr>
+        <w:t>0</w:t>
+      </w:r>
+      <w:r>
+        <w:rPr>
+          <w:lang w:val="en-US"/>
+        </w:rPr>
+        <w:t>08)</w:t>
+      </w:r>
+      <w:r>
+        <w:rPr>
+          <w:lang w:val="en-US"/>
+        </w:rPr>
+        <w:t>. Workforce not necessarily representative of the overall Norwegian population.</w:t>
+      </w:r>
+      <w:r>
+        <w:rPr>
+          <w:lang w:val="en-US"/>
+        </w:rPr>
+        <w:t xml:space="preserve"> </w:t>
+      </w:r>
+    </w:p>
+    <w:p>
+      <w:pPr>
+        <w:pStyle w:val="Heading3"/>
+        <w:rPr>
+          <w:lang w:val="en-US"/>
+        </w:rPr>
+      </w:pPr>
+      <w:r>
+        <w:rPr>
+          <w:lang w:val="en-US"/>
+        </w:rPr>
+        <w:t xml:space="preserve">SHOT 2014 </w:t>
+      </w:r>
+      <w:r>
+        <w:rPr>
+          <w:lang w:val="en-US"/>
+        </w:rPr>
+        <w:t>(excluded)</w:t>
+      </w:r>
+    </w:p>
+    <w:p>
+      <w:pPr>
+        <w:rPr>
+          <w:lang w:val="en-US"/>
+        </w:rPr>
+      </w:pPr>
+      <w:r>
+        <w:rPr>
+          <w:lang w:val="en-US"/>
+        </w:rPr>
+        <w:t xml:space="preserve">They cited the BFI-20S tool, but when given access to the data, it appeared not to have used the same scale after all. </w:t>
+      </w:r>
+    </w:p>
+    <w:p>
+      <w:pPr>
+        <w:rPr>
+          <w:lang w:val="en-US"/>
+        </w:rPr>
+      </w:pPr>
       <w:proofErr w:type="spellStart"/>
       <w:r>
-        <w:fldChar w:fldCharType="begin"/>
-      </w:r>
-      <w:r>
-        <w:instrText>HYPERLINK "https://journals.sagepub.com/doi/full/10.1177/1029864917709519?casa_token=luPthBWxv2sAAAAA%3ANYW4aKge_0IpAhkwKTWB9c46QKJnBEl-HkJYSzE2mUs8uQS7hF_TEqw6Cq-lVs6OSRCW0fgBlN93" \l "bibr25-1029864917709519"</w:instrText>
-      </w:r>
-      <w:r>
-        <w:fldChar w:fldCharType="separate"/>
-      </w:r>
-      <w:r>
-        <w:rPr>
-          <w:rStyle w:val="Hyperlink"/>
-          <w:lang w:val="en-US"/>
-        </w:rPr>
-        <w:t>Lappegård</w:t>
+        <w:rPr>
+          <w:lang w:val="en-US"/>
+        </w:rPr>
+        <w:t>Erevik</w:t>
       </w:r>
       <w:proofErr w:type="spellEnd"/>
       <w:r>
         <w:rPr>
-          <w:rStyle w:val="Hyperlink"/>
-          <w:lang w:val="en-US"/>
-        </w:rPr>
-        <w:t xml:space="preserve"> &amp; Veenstra, 2010</w:t>
-      </w:r>
-      <w:r>
-        <w:fldChar w:fldCharType="end"/>
-      </w:r>
-      <w:r>
-        <w:rPr>
-          <w:lang w:val="en-US"/>
-        </w:rPr>
-        <w:t>).»</w:t>
-      </w:r>
-    </w:p>
-    <w:p>
-      <w:pPr>
-        <w:rPr>
-          <w:lang w:val="en-US"/>
-        </w:rPr>
-      </w:pPr>
-      <w:r>
-        <w:rPr>
-          <w:lang w:val="en-US"/>
-        </w:rPr>
-        <w:t xml:space="preserve">Pros: </w:t>
-      </w:r>
-      <w:r>
-        <w:rPr>
-          <w:sz w:val="28"/>
-          <w:szCs w:val="28"/>
-          <w:lang w:val="en-US"/>
-        </w:rPr>
-        <w:t>Large</w:t>
-      </w:r>
-      <w:r>
-        <w:rPr>
-          <w:lang w:val="en-US"/>
-        </w:rPr>
-        <w:t xml:space="preserve"> sample</w:t>
-      </w:r>
-      <w:r>
-        <w:rPr>
-          <w:lang w:val="en-US"/>
-        </w:rPr>
-        <w:t xml:space="preserve"> (n=6327)</w:t>
-      </w:r>
-      <w:r>
-        <w:rPr>
-          <w:lang w:val="en-US"/>
-        </w:rPr>
-        <w:t xml:space="preserve">, has used the same </w:t>
-      </w:r>
-      <w:r>
-        <w:rPr>
-          <w:lang w:val="en-US"/>
-        </w:rPr>
-        <w:t xml:space="preserve">Norwegian </w:t>
-      </w:r>
-      <w:r>
-        <w:rPr>
-          <w:lang w:val="en-US"/>
-        </w:rPr>
-        <w:t xml:space="preserve">BFI-20S tool. </w:t>
-      </w:r>
-      <w:r>
-        <w:rPr>
-          <w:lang w:val="en-US"/>
-        </w:rPr>
-        <w:t xml:space="preserve">Response rate </w:t>
-      </w:r>
-      <w:r>
-        <w:rPr>
-          <w:lang w:val="en-US"/>
-        </w:rPr>
-        <w:t>is not as bad as it could be</w:t>
-      </w:r>
-      <w:r>
-        <w:rPr>
-          <w:lang w:val="en-US"/>
-        </w:rPr>
-        <w:t xml:space="preserve">: 60% </w:t>
-      </w:r>
-      <w:r>
-        <w:rPr>
-          <w:lang w:val="en-US"/>
-        </w:rPr>
-        <w:t xml:space="preserve">of telephoned subjects </w:t>
-      </w:r>
-      <w:r>
-        <w:rPr>
-          <w:lang w:val="en-US"/>
-        </w:rPr>
-        <w:t>were interviewed, and 73% of interviewed subjects responded to the questionnaire</w:t>
-      </w:r>
-      <w:r>
-        <w:rPr>
-          <w:lang w:val="en-US"/>
-        </w:rPr>
-        <w:t>, then 58% of those were «workers»</w:t>
-      </w:r>
-      <w:r>
-        <w:rPr>
-          <w:lang w:val="en-US"/>
-        </w:rPr>
-        <w:t>.</w:t>
-      </w:r>
-      <w:r>
-        <w:rPr>
-          <w:lang w:val="en-US"/>
-        </w:rPr>
-        <w:t xml:space="preserve"> </w:t>
-      </w:r>
-      <w:r>
-        <w:br/>
-      </w:r>
-      <w:r>
-        <w:br/>
-      </w:r>
-      <w:r>
-        <w:rPr>
-          <w:lang w:val="en-US"/>
-        </w:rPr>
-        <w:t>Cons: Rather old sample</w:t>
-      </w:r>
-      <w:r>
-        <w:rPr>
-          <w:lang w:val="en-US"/>
-        </w:rPr>
-        <w:t xml:space="preserve"> (2007-2</w:t>
-      </w:r>
-      <w:r>
-        <w:rPr>
-          <w:lang w:val="en-US"/>
-        </w:rPr>
-        <w:t>0</w:t>
-      </w:r>
-      <w:r>
-        <w:rPr>
-          <w:lang w:val="en-US"/>
-        </w:rPr>
-        <w:t>08)</w:t>
-      </w:r>
-      <w:r>
-        <w:rPr>
-          <w:lang w:val="en-US"/>
-        </w:rPr>
-        <w:t>. Workforce not necessarily representative of the overall Norwegian population.</w:t>
-      </w:r>
-      <w:r>
-        <w:rPr>
-          <w:lang w:val="en-US"/>
-        </w:rPr>
-        <w:t xml:space="preserve"> </w:t>
-      </w:r>
-    </w:p>
-    <w:p>
-      <w:pPr>
-        <w:pStyle w:val="Heading3"/>
-        <w:rPr>
-          <w:lang w:val="en-US"/>
-        </w:rPr>
-      </w:pPr>
-      <w:r>
-        <w:rPr>
-          <w:lang w:val="en-US"/>
-        </w:rPr>
-        <w:t xml:space="preserve">SHOT 2014 </w:t>
-      </w:r>
-    </w:p>
-    <w:p>
-      <w:pPr>
-        <w:rPr>
-          <w:lang w:val="en-US"/>
-        </w:rPr>
-      </w:pPr>
-      <w:proofErr w:type="spellStart"/>
-      <w:r>
-        <w:rPr>
-          <w:lang w:val="en-US"/>
-        </w:rPr>
-        <w:t>Erevik</w:t>
-      </w:r>
-      <w:proofErr w:type="spellEnd"/>
-      <w:r>
-        <w:rPr>
           <w:lang w:val="en-US"/>
         </w:rPr>
         <w:t xml:space="preserve"> et al. 2023</w:t>
@@ -1479,7 +1583,7 @@
         </w:rPr>
         <w:t xml:space="preserve">. </w:t>
       </w:r>
-      <w:hyperlink r:id="rId12" w:history="1">
+      <w:hyperlink r:id="rId13" w:history="1">
         <w:r>
           <w:rPr>
             <w:rStyle w:val="Hyperlink"/>
@@ -1840,7 +1944,7 @@
         </w:rPr>
         <w:t xml:space="preserve">. </w:t>
       </w:r>
-      <w:hyperlink r:id="rId13" w:history="1">
+      <w:hyperlink r:id="rId14" w:history="1">
         <w:r>
           <w:rPr>
             <w:rStyle w:val="Hyperlink"/>
@@ -1866,6 +1970,7 @@
         <w:rPr>
           <w:lang w:val="en-US"/>
         </w:rPr>
+        <w:lastRenderedPageBreak/>
         <w:t xml:space="preserve">Pros: 7-point Likert scale. </w:t>
       </w:r>
       <w:r>
@@ -1941,7 +2046,6 @@
         <w:rPr>
           <w:lang w:val="en-US"/>
         </w:rPr>
-        <w:lastRenderedPageBreak/>
         <w:t>Plaisant</w:t>
       </w:r>
       <w:proofErr w:type="spellEnd"/>
@@ -1976,7 +2080,7 @@
         </w:rPr>
         <w:t xml:space="preserve">. </w:t>
       </w:r>
-      <w:hyperlink r:id="rId14">
+      <w:hyperlink r:id="rId15">
         <w:r>
           <w:rPr>
             <w:rStyle w:val="Hyperlink"/>
@@ -2098,7 +2202,7 @@
         </w:rPr>
         <w:t xml:space="preserve">Wilson et al. 2013 </w:t>
       </w:r>
-      <w:hyperlink r:id="rId15">
+      <w:hyperlink r:id="rId16">
         <w:r>
           <w:rPr>
             <w:rStyle w:val="Hyperlink"/>
@@ -2185,7 +2289,7 @@
         </w:rPr>
         <w:t xml:space="preserve">Singh et al. 2024. </w:t>
       </w:r>
-      <w:hyperlink r:id="rId16">
+      <w:hyperlink r:id="rId17">
         <w:r>
           <w:rPr>
             <w:rStyle w:val="Hyperlink"/>
@@ -2242,7 +2346,7 @@
         </w:rPr>
         <w:t xml:space="preserve"> 2023. </w:t>
       </w:r>
-      <w:hyperlink r:id="rId17">
+      <w:hyperlink r:id="rId18">
         <w:r>
           <w:rPr>
             <w:rStyle w:val="Hyperlink"/>
@@ -2322,7 +2426,7 @@
         </w:rPr>
         <w:t xml:space="preserve"> </w:t>
       </w:r>
-      <w:hyperlink r:id="rId18">
+      <w:hyperlink r:id="rId19">
         <w:r>
           <w:rPr>
             <w:rStyle w:val="Hyperlink"/>
@@ -2464,7 +2568,7 @@
         </w:rPr>
         <w:t xml:space="preserve">. </w:t>
       </w:r>
-      <w:hyperlink r:id="rId19">
+      <w:hyperlink r:id="rId20">
         <w:r>
           <w:rPr>
             <w:rStyle w:val="Hyperlink"/>
@@ -2568,7 +2672,7 @@
         </w:rPr>
         <w:t xml:space="preserve">Myers-Briggs have posted this on their website: </w:t>
       </w:r>
-      <w:hyperlink r:id="rId20" w:history="1">
+      <w:hyperlink r:id="rId21" w:history="1">
         <w:r>
           <w:rPr>
             <w:rStyle w:val="Hyperlink"/>
@@ -2594,6 +2698,7 @@
         <w:rPr>
           <w:lang w:val="en-US"/>
         </w:rPr>
+        <w:lastRenderedPageBreak/>
         <w:t>Pros: Spread across Norway</w:t>
       </w:r>
       <w:r>
@@ -2696,7 +2801,6 @@
       </w:pPr>
       <w:proofErr w:type="spellStart"/>
       <w:r>
-        <w:lastRenderedPageBreak/>
         <w:t>Tobieszewska</w:t>
       </w:r>
       <w:proofErr w:type="spellEnd"/>
@@ -2719,7 +2823,7 @@
         </w:rPr>
         <w:t xml:space="preserve">Personality Types of Medical Students in Terms of Their Choice of Medical Specialty: Cross-Sectional Study. </w:t>
       </w:r>
-      <w:hyperlink r:id="rId21">
+      <w:hyperlink r:id="rId22">
         <w:r>
           <w:rPr>
             <w:rStyle w:val="Hyperlink"/>
@@ -2815,7 +2919,7 @@
         <w:pStyle w:val="Heading2"/>
       </w:pPr>
       <w:r>
-        <w:t>Version updates</w:t>
+        <w:t>Change log</w:t>
       </w:r>
     </w:p>
     <w:p>
@@ -2880,7 +2984,7 @@
           <w:lang w:val="en-US"/>
         </w:rPr>
       </w:pPr>
-      <w:hyperlink r:id="rId22" w:history="1">
+      <w:hyperlink r:id="rId23" w:history="1">
         <w:r>
           <w:rPr>
             <w:rStyle w:val="Hyperlink"/>
@@ -2940,6 +3044,89 @@
         </w:rPr>
         <w:t xml:space="preserve">-alpha. </w:t>
       </w:r>
+    </w:p>
+    <w:p>
+      <w:pPr>
+        <w:rPr>
+          <w:lang w:val="en-US"/>
+        </w:rPr>
+      </w:pPr>
+      <w:r>
+        <w:rPr>
+          <w:lang w:val="en-US"/>
+        </w:rPr>
+        <w:t>2025-</w:t>
+      </w:r>
+      <w:r>
+        <w:rPr>
+          <w:lang w:val="en-US"/>
+        </w:rPr>
+        <w:t xml:space="preserve">12-12 We found out the </w:t>
+      </w:r>
+      <w:proofErr w:type="spellStart"/>
+      <w:r>
+        <w:rPr>
+          <w:lang w:val="en-US"/>
+        </w:rPr>
+        <w:t>SHoT</w:t>
+      </w:r>
+      <w:proofErr w:type="spellEnd"/>
+      <w:r>
+        <w:rPr>
+          <w:lang w:val="en-US"/>
+        </w:rPr>
+        <w:t xml:space="preserve"> had rather misleading text about the questionnaire. They had not used the same as </w:t>
+      </w:r>
+      <w:r>
+        <w:rPr>
+          <w:lang w:val="en-US"/>
+        </w:rPr>
+        <w:t xml:space="preserve">the cited translation of Big-5, but been inspired by it. We chose not to compare with these data after all. </w:t>
+      </w:r>
+    </w:p>
+    <w:p>
+      <w:pPr>
+        <w:rPr>
+          <w:lang w:val="en-US"/>
+        </w:rPr>
+      </w:pPr>
+      <w:r>
+        <w:rPr>
+          <w:lang w:val="en-US"/>
+        </w:rPr>
+        <w:t xml:space="preserve">2026-01-22 In January 2026 we collected more data. The MBTI questionnaire was changed. </w:t>
+      </w:r>
+      <w:r>
+        <w:rPr>
+          <w:lang w:val="en-US"/>
+        </w:rPr>
+        <w:t xml:space="preserve">Assertive vs. Turbulent was </w:t>
+      </w:r>
+      <w:r>
+        <w:rPr>
+          <w:lang w:val="en-US"/>
+        </w:rPr>
+        <w:t>added</w:t>
+      </w:r>
+      <w:r>
+        <w:rPr>
+          <w:lang w:val="en-US"/>
+        </w:rPr>
+        <w:t xml:space="preserve">, allowing new analyses. </w:t>
+      </w:r>
+      <w:r>
+        <w:rPr>
+          <w:lang w:val="en-US"/>
+        </w:rPr>
+        <w:t>In addition, the degree of MBTI dimensions was collected. This allowed analyzing the degrees continuously, in the same manner as Big-5.</w:t>
+      </w:r>
+    </w:p>
+    <w:p>
+      <w:pPr>
+        <w:rPr>
+          <w:lang w:val="en-US"/>
+        </w:rPr>
+      </w:pPr>
     </w:p>
     <w:p>
       <w:pPr>
@@ -3853,6 +4040,7 @@
   <w:style w:type="character" w:default="1" w:styleId="DefaultParagraphFont">
     <w:name w:val="Default Paragraph Font"/>
     <w:uiPriority w:val="1"/>
+    <w:semiHidden/>
     <w:unhideWhenUsed/>
   </w:style>
   <w:style w:type="table" w:default="1" w:styleId="TableNormal">
@@ -4511,8 +4699,8 @@
 </file>
 
 <file path=customXml/item2.xml><?xml version="1.0" encoding="utf-8"?>
-<ct:contentTypeSchema xmlns:ct="http://schemas.microsoft.com/office/2006/metadata/contentType" xmlns:ma="http://schemas.microsoft.com/office/2006/metadata/properties/metaAttributes" ct:_="" ma:_="" ma:contentTypeName="Dokument" ma:contentTypeID="0x0101002FD2B189224EAB429D6E9D951C4B8706" ma:contentTypeVersion="10" ma:contentTypeDescription="Opprett et nytt dokument." ma:contentTypeScope="" ma:versionID="aa2411e86a6cea06c986399c3aac7408">
-  <xsd:schema xmlns:xsd="http://www.w3.org/2001/XMLSchema" xmlns:xs="http://www.w3.org/2001/XMLSchema" xmlns:p="http://schemas.microsoft.com/office/2006/metadata/properties" xmlns:ns2="3dd1c965-52c6-4487-92af-739379b659ac" xmlns:ns3="e29f6279-0e28-4edd-8338-8230b9969525" targetNamespace="http://schemas.microsoft.com/office/2006/metadata/properties" ma:root="true" ma:fieldsID="accf30a8a610022cfee74474aabf405c" ns2:_="" ns3:_="">
+<ct:contentTypeSchema xmlns:ct="http://schemas.microsoft.com/office/2006/metadata/contentType" xmlns:ma="http://schemas.microsoft.com/office/2006/metadata/properties/metaAttributes" ct:_="" ma:_="" ma:contentTypeName="Dokument" ma:contentTypeID="0x0101002FD2B189224EAB429D6E9D951C4B8706" ma:contentTypeVersion="10" ma:contentTypeDescription="Opprett et nytt dokument." ma:contentTypeScope="" ma:versionID="76b2d4e0fbb0593b7295742e5623b229">
+  <xsd:schema xmlns:xsd="http://www.w3.org/2001/XMLSchema" xmlns:xs="http://www.w3.org/2001/XMLSchema" xmlns:p="http://schemas.microsoft.com/office/2006/metadata/properties" xmlns:ns2="3dd1c965-52c6-4487-92af-739379b659ac" xmlns:ns3="e29f6279-0e28-4edd-8338-8230b9969525" targetNamespace="http://schemas.microsoft.com/office/2006/metadata/properties" ma:root="true" ma:fieldsID="4119151203ac95a509947089f64867e1" ns2:_="" ns3:_="">
     <xsd:import namespace="3dd1c965-52c6-4487-92af-739379b659ac"/>
     <xsd:import namespace="e29f6279-0e28-4edd-8338-8230b9969525"/>
     <xsd:element name="properties">
@@ -4720,22 +4908,7 @@
 </file>
 
 <file path=customXml/itemProps2.xml><?xml version="1.0" encoding="utf-8"?>
-<ds:datastoreItem xmlns:ds="http://schemas.openxmlformats.org/officeDocument/2006/customXml" ds:itemID="{3F9A98A8-737A-4071-824A-DA67AF5AB367}">
-  <ds:schemaRefs>
-    <ds:schemaRef ds:uri="http://schemas.microsoft.com/office/2006/metadata/contentType"/>
-    <ds:schemaRef ds:uri="http://schemas.microsoft.com/office/2006/metadata/properties/metaAttributes"/>
-    <ds:schemaRef ds:uri="http://www.w3.org/2001/XMLSchema"/>
-    <ds:schemaRef ds:uri="http://schemas.microsoft.com/office/2006/metadata/properties"/>
-    <ds:schemaRef ds:uri="3dd1c965-52c6-4487-92af-739379b659ac"/>
-    <ds:schemaRef ds:uri="e29f6279-0e28-4edd-8338-8230b9969525"/>
-    <ds:schemaRef ds:uri="http://schemas.microsoft.com/office/2006/documentManagement/types"/>
-    <ds:schemaRef ds:uri="http://schemas.microsoft.com/office/infopath/2007/PartnerControls"/>
-    <ds:schemaRef ds:uri="http://schemas.openxmlformats.org/package/2006/metadata/core-properties"/>
-    <ds:schemaRef ds:uri="http://purl.org/dc/elements/1.1/"/>
-    <ds:schemaRef ds:uri="http://purl.org/dc/terms/"/>
-    <ds:schemaRef ds:uri="http://schemas.microsoft.com/internal/obd"/>
-  </ds:schemaRefs>
-</ds:datastoreItem>
+<ds:datastoreItem xmlns:ds="http://schemas.openxmlformats.org/officeDocument/2006/customXml" ds:itemID="{11D8E319-16BF-4646-B1E7-C906A9C714FB}"/>
 </file>
 
 <file path=customXml/itemProps3.xml><?xml version="1.0" encoding="utf-8"?>

</xml_diff>

<commit_message>
Updated with admission quota analysis
</commit_message>
<xml_diff>
--- a/analysis protocol.docx
+++ b/analysis protocol.docx
@@ -155,37 +155,7 @@
         <w:rPr>
           <w:lang w:val="en-US"/>
         </w:rPr>
-        <w:t xml:space="preserve">Test difference between MBTI </w:t>
-      </w:r>
-      <w:r>
-        <w:rPr>
-          <w:lang w:val="en-US"/>
-        </w:rPr>
-        <w:t>Intuitive</w:t>
-      </w:r>
-      <w:r>
-        <w:rPr>
-          <w:lang w:val="en-US"/>
-        </w:rPr>
-        <w:t xml:space="preserve"> vs. </w:t>
-      </w:r>
-      <w:r>
-        <w:rPr>
-          <w:lang w:val="en-US"/>
-        </w:rPr>
-        <w:t>Observant</w:t>
-      </w:r>
-      <w:r>
-        <w:rPr>
-          <w:lang w:val="en-US"/>
-        </w:rPr>
-        <w:t xml:space="preserve"> in Big-5 </w:t>
-      </w:r>
-      <w:r>
-        <w:rPr>
-          <w:lang w:val="en-US"/>
-        </w:rPr>
-        <w:t>openness</w:t>
+        <w:t>Test difference between MBTI Intuitive vs. Observant in Big-5 openness</w:t>
       </w:r>
     </w:p>
     <w:p>
@@ -234,6 +204,24 @@
           <w:lang w:val="en-US"/>
         </w:rPr>
         <w:t>Test difference between MBTI Thinking vs. Feeling in Big-5 agreeableness</w:t>
+      </w:r>
+    </w:p>
+    <w:p>
+      <w:pPr>
+        <w:pStyle w:val="ListParagraph"/>
+        <w:numPr>
+          <w:ilvl w:val="0"/>
+          <w:numId w:val="1"/>
+        </w:numPr>
+        <w:rPr>
+          <w:lang w:val="en-US"/>
+        </w:rPr>
+      </w:pPr>
+      <w:r>
+        <w:rPr>
+          <w:lang w:val="en-US"/>
+        </w:rPr>
+        <w:t>Test difference between MBTI Thinking vs. Feeling in Big-5 conscientiousness</w:t>
       </w:r>
     </w:p>
     <w:p>
@@ -557,6 +545,7 @@
         <w:pStyle w:val="Heading1"/>
       </w:pPr>
       <w:r>
+        <w:lastRenderedPageBreak/>
         <w:t>Within-study comparisons</w:t>
       </w:r>
     </w:p>
@@ -595,7 +584,6 @@
         <w:rPr>
           <w:lang w:val="en-US"/>
         </w:rPr>
-        <w:lastRenderedPageBreak/>
         <w:t>Hypothesis testing can quickly lead to many p-values</w:t>
       </w:r>
       <w:r>
@@ -1179,6 +1167,7 @@
         <w:pStyle w:val="Heading2"/>
       </w:pPr>
       <w:r>
+        <w:lastRenderedPageBreak/>
         <w:t>World-wide norm population</w:t>
       </w:r>
     </w:p>
@@ -1220,14 +1209,7 @@
         <w:rPr>
           <w:lang w:val="en-US"/>
         </w:rPr>
-        <w:t xml:space="preserve">Pros: 19 000+ responses from all across the world, the raw data is available, allowing item-to-item comparisons, and opens the ability to check distributions before a potential t-test, ANOVA or linear </w:t>
-      </w:r>
-      <w:r>
-        <w:rPr>
-          <w:lang w:val="en-US"/>
-        </w:rPr>
-        <w:lastRenderedPageBreak/>
-        <w:t xml:space="preserve">interpolation. Can also report characteristics like age, gender and </w:t>
+        <w:t xml:space="preserve">Pros: 19 000+ responses from all across the world, the raw data is available, allowing item-to-item comparisons, and opens the ability to check distributions before a potential t-test, ANOVA or linear interpolation. Can also report characteristics like age, gender and </w:t>
       </w:r>
       <w:proofErr w:type="spellStart"/>
       <w:r>
@@ -1470,9 +1452,15 @@
         <w:t xml:space="preserve"> </w:t>
       </w:r>
       <w:r>
+        <w:rPr>
+          <w:lang w:val="en-US"/>
+        </w:rPr>
         <w:br/>
       </w:r>
       <w:r>
+        <w:rPr>
+          <w:lang w:val="en-US"/>
+        </w:rPr>
         <w:br/>
       </w:r>
       <w:r>
@@ -1636,6 +1624,9 @@
         <w:t xml:space="preserve">. </w:t>
       </w:r>
       <w:r>
+        <w:rPr>
+          <w:lang w:val="en-US"/>
+        </w:rPr>
         <w:br/>
       </w:r>
       <w:r>
@@ -1849,6 +1840,7 @@
         <w:rPr>
           <w:lang w:val="en-US"/>
         </w:rPr>
+        <w:lastRenderedPageBreak/>
         <w:t xml:space="preserve">We could still compare BFI with </w:t>
       </w:r>
       <w:r>
@@ -1970,7 +1962,6 @@
         <w:rPr>
           <w:lang w:val="en-US"/>
         </w:rPr>
-        <w:lastRenderedPageBreak/>
         <w:t xml:space="preserve">Pros: 7-point Likert scale. </w:t>
       </w:r>
       <w:r>
@@ -1980,9 +1971,15 @@
         <w:t>Decent sample (n=880).</w:t>
       </w:r>
       <w:r>
+        <w:rPr>
+          <w:lang w:val="en-US"/>
+        </w:rPr>
         <w:br/>
       </w:r>
       <w:r>
+        <w:rPr>
+          <w:lang w:val="en-US"/>
+        </w:rPr>
         <w:br/>
       </w:r>
       <w:r>
@@ -2238,6 +2235,9 @@
         <w:t xml:space="preserve"> </w:t>
       </w:r>
       <w:r>
+        <w:rPr>
+          <w:lang w:val="en-US"/>
+        </w:rPr>
         <w:br/>
       </w:r>
       <w:r>
@@ -2305,6 +2305,9 @@
         <w:t xml:space="preserve"> </w:t>
       </w:r>
       <w:r>
+        <w:rPr>
+          <w:lang w:val="en-US"/>
+        </w:rPr>
         <w:br/>
       </w:r>
       <w:r>
@@ -2355,6 +2358,9 @@
           <w:t>https://doi.org/10.1080/00223980.2024.2369618</w:t>
         </w:r>
         <w:r>
+          <w:rPr>
+            <w:lang w:val="en-US"/>
+          </w:rPr>
           <w:br/>
         </w:r>
       </w:hyperlink>
@@ -2371,9 +2377,15 @@
         <w:t>The research sample consists of 203 participants (50 medical students, 153 healthcare professionals). Used 5-item Likert scale.</w:t>
       </w:r>
       <w:r>
+        <w:rPr>
+          <w:lang w:val="en-US"/>
+        </w:rPr>
         <w:br/>
       </w:r>
       <w:r>
+        <w:rPr>
+          <w:lang w:val="en-US"/>
+        </w:rPr>
         <w:br/>
       </w:r>
       <w:r>
@@ -2469,59 +2481,32 @@
         <w:rPr>
           <w:sz w:val="24"/>
           <w:szCs w:val="24"/>
-          <w:lang w:val="en-US"/>
-        </w:rPr>
-      </w:pPr>
+        </w:rPr>
+      </w:pPr>
+      <w:proofErr w:type="spellStart"/>
       <w:r>
         <w:rPr>
           <w:b/>
           <w:bCs/>
           <w:sz w:val="24"/>
           <w:szCs w:val="24"/>
-          <w:lang w:val="en-US"/>
-        </w:rPr>
-        <w:t>Include:</w:t>
-      </w:r>
-      <w:r>
-        <w:rPr>
-          <w:sz w:val="24"/>
-          <w:szCs w:val="24"/>
-          <w:lang w:val="en-US"/>
-        </w:rPr>
-        <w:t xml:space="preserve"> </w:t>
-      </w:r>
-      <w:r>
-        <w:rPr>
-          <w:sz w:val="24"/>
-          <w:szCs w:val="24"/>
-          <w:lang w:val="en-US"/>
-        </w:rPr>
-        <w:t>Krasner et al. 2024, Norwegian population</w:t>
-      </w:r>
-    </w:p>
-    <w:p>
-      <w:pPr>
-        <w:rPr>
-          <w:sz w:val="24"/>
-          <w:szCs w:val="24"/>
-          <w:lang w:val="en-US"/>
-        </w:rPr>
-      </w:pPr>
+        </w:rPr>
+        <w:t>Include</w:t>
+      </w:r>
+      <w:proofErr w:type="spellEnd"/>
       <w:r>
         <w:rPr>
           <w:b/>
           <w:bCs/>
           <w:sz w:val="24"/>
           <w:szCs w:val="24"/>
-          <w:lang w:val="en-US"/>
-        </w:rPr>
-        <w:t>Exclude:</w:t>
+        </w:rPr>
+        <w:t>:</w:t>
       </w:r>
       <w:r>
         <w:rPr>
           <w:sz w:val="24"/>
           <w:szCs w:val="24"/>
-          <w:lang w:val="en-US"/>
         </w:rPr>
         <w:t xml:space="preserve"> </w:t>
       </w:r>
@@ -2531,7 +2516,7 @@
           <w:sz w:val="24"/>
           <w:szCs w:val="24"/>
         </w:rPr>
-        <w:t>Tobieszewska</w:t>
+        <w:t>Krasner</w:t>
       </w:r>
       <w:proofErr w:type="spellEnd"/>
       <w:r>
@@ -2539,15 +2524,89 @@
           <w:sz w:val="24"/>
           <w:szCs w:val="24"/>
         </w:rPr>
+        <w:t xml:space="preserve"> et al. 2024, Norwegian </w:t>
+      </w:r>
+      <w:proofErr w:type="spellStart"/>
+      <w:r>
+        <w:rPr>
+          <w:sz w:val="24"/>
+          <w:szCs w:val="24"/>
+        </w:rPr>
+        <w:t>population</w:t>
+      </w:r>
+      <w:proofErr w:type="spellEnd"/>
+    </w:p>
+    <w:p>
+      <w:pPr>
+        <w:rPr>
+          <w:sz w:val="24"/>
+          <w:szCs w:val="24"/>
+        </w:rPr>
+      </w:pPr>
+      <w:proofErr w:type="spellStart"/>
+      <w:r>
+        <w:rPr>
+          <w:b/>
+          <w:bCs/>
+          <w:sz w:val="24"/>
+          <w:szCs w:val="24"/>
+        </w:rPr>
+        <w:t>Exclude</w:t>
+      </w:r>
+      <w:proofErr w:type="spellEnd"/>
+      <w:r>
+        <w:rPr>
+          <w:b/>
+          <w:bCs/>
+          <w:sz w:val="24"/>
+          <w:szCs w:val="24"/>
+        </w:rPr>
+        <w:t>:</w:t>
+      </w:r>
+      <w:r>
+        <w:rPr>
+          <w:sz w:val="24"/>
+          <w:szCs w:val="24"/>
+        </w:rPr>
+        <w:t xml:space="preserve"> </w:t>
+      </w:r>
+      <w:proofErr w:type="spellStart"/>
+      <w:r>
+        <w:rPr>
+          <w:sz w:val="24"/>
+          <w:szCs w:val="24"/>
+        </w:rPr>
+        <w:t>Tobieszewska</w:t>
+      </w:r>
+      <w:proofErr w:type="spellEnd"/>
+      <w:r>
+        <w:rPr>
+          <w:sz w:val="24"/>
+          <w:szCs w:val="24"/>
+        </w:rPr>
         <w:t xml:space="preserve"> et al. 2024</w:t>
       </w:r>
     </w:p>
     <w:p>
       <w:pPr>
         <w:pStyle w:val="Heading2"/>
-      </w:pPr>
-      <w:r>
-        <w:t xml:space="preserve">Krasner et al. 2024. </w:t>
+        <w:rPr>
+          <w:lang w:val="nb-NO"/>
+        </w:rPr>
+      </w:pPr>
+      <w:proofErr w:type="spellStart"/>
+      <w:r>
+        <w:rPr>
+          <w:lang w:val="nb-NO"/>
+        </w:rPr>
+        <w:t>Krasner</w:t>
+      </w:r>
+      <w:proofErr w:type="spellEnd"/>
+      <w:r>
+        <w:rPr>
+          <w:lang w:val="nb-NO"/>
+        </w:rPr>
+        <w:t xml:space="preserve"> et al. 2024. </w:t>
       </w:r>
     </w:p>
     <w:p>
@@ -2594,6 +2653,7 @@
         <w:rPr>
           <w:lang w:val="en-US"/>
         </w:rPr>
+        <w:lastRenderedPageBreak/>
         <w:t xml:space="preserve">Pros: </w:t>
       </w:r>
       <w:r>
@@ -2698,7 +2758,6 @@
         <w:rPr>
           <w:lang w:val="en-US"/>
         </w:rPr>
-        <w:lastRenderedPageBreak/>
         <w:t>Pros: Spread across Norway</w:t>
       </w:r>
       <w:r>
@@ -2762,6 +2821,9 @@
         <w:t xml:space="preserve"> </w:t>
       </w:r>
       <w:r>
+        <w:rPr>
+          <w:lang w:val="en-US"/>
+        </w:rPr>
         <w:br/>
       </w:r>
       <w:r>
@@ -2839,9 +2901,15 @@
         <w:t xml:space="preserve"> </w:t>
       </w:r>
       <w:r>
+        <w:rPr>
+          <w:lang w:val="en-US"/>
+        </w:rPr>
         <w:br/>
       </w:r>
       <w:r>
+        <w:rPr>
+          <w:lang w:val="en-US"/>
+        </w:rPr>
         <w:br/>
       </w:r>
       <w:r>
@@ -2851,6 +2919,9 @@
         <w:t>Pros: Large sample (2104), recent (data 2020).</w:t>
       </w:r>
       <w:r>
+        <w:rPr>
+          <w:lang w:val="en-US"/>
+        </w:rPr>
         <w:br/>
       </w:r>
       <w:r>
@@ -2872,6 +2943,9 @@
         <w:t>all Polish medical students (37 000).</w:t>
       </w:r>
       <w:r>
+        <w:rPr>
+          <w:lang w:val="en-US"/>
+        </w:rPr>
         <w:br/>
       </w:r>
       <w:r>
@@ -3094,25 +3168,7 @@
         <w:rPr>
           <w:lang w:val="en-US"/>
         </w:rPr>
-        <w:t xml:space="preserve">2026-01-22 In January 2026 we collected more data. The MBTI questionnaire was changed. </w:t>
-      </w:r>
-      <w:r>
-        <w:rPr>
-          <w:lang w:val="en-US"/>
-        </w:rPr>
-        <w:t xml:space="preserve">Assertive vs. Turbulent was </w:t>
-      </w:r>
-      <w:r>
-        <w:rPr>
-          <w:lang w:val="en-US"/>
-        </w:rPr>
-        <w:t>added</w:t>
-      </w:r>
-      <w:r>
-        <w:rPr>
-          <w:lang w:val="en-US"/>
-        </w:rPr>
-        <w:t xml:space="preserve">, allowing new analyses. </w:t>
+        <w:t xml:space="preserve">2026-01-22 In January 2026 we collected more data. The MBTI questionnaire was changed. Assertive vs. Turbulent was added, allowing new analyses. </w:t>
       </w:r>
       <w:r>
         <w:rPr>
@@ -3120,6 +3176,50 @@
         </w:rPr>
         <w:t>In addition, the degree of MBTI dimensions was collected. This allowed analyzing the degrees continuously, in the same manner as Big-5.</w:t>
       </w:r>
+    </w:p>
+    <w:p>
+      <w:pPr>
+        <w:rPr>
+          <w:lang w:val="en-US"/>
+        </w:rPr>
+      </w:pPr>
+      <w:r>
+        <w:rPr>
+          <w:lang w:val="en-US"/>
+        </w:rPr>
+        <w:t xml:space="preserve">2026-03-20 We considered that age is a surrogate measure for which admissions quota students entered with &lt;=21 for first diploma, &gt;21 for ordinary quota. </w:t>
+      </w:r>
+      <w:r>
+        <w:rPr>
+          <w:lang w:val="en-US"/>
+        </w:rPr>
+        <w:t>To explore the impact of the admi</w:t>
+      </w:r>
+      <w:r>
+        <w:rPr>
+          <w:lang w:val="en-US"/>
+        </w:rPr>
+        <w:t>s</w:t>
+      </w:r>
+      <w:r>
+        <w:rPr>
+          <w:lang w:val="en-US"/>
+        </w:rPr>
+        <w:t xml:space="preserve">sions system, we </w:t>
+      </w:r>
+      <w:r>
+        <w:rPr>
+          <w:lang w:val="en-US"/>
+        </w:rPr>
+        <w:t xml:space="preserve">assessed the differences between these groups and MBTI and Big Five. </w:t>
+      </w:r>
+    </w:p>
+    <w:p>
+      <w:pPr>
+        <w:rPr>
+          <w:lang w:val="en-US"/>
+        </w:rPr>
+      </w:pPr>
     </w:p>
     <w:p>
       <w:pPr>
@@ -4908,7 +5008,22 @@
 </file>
 
 <file path=customXml/itemProps2.xml><?xml version="1.0" encoding="utf-8"?>
-<ds:datastoreItem xmlns:ds="http://schemas.openxmlformats.org/officeDocument/2006/customXml" ds:itemID="{11D8E319-16BF-4646-B1E7-C906A9C714FB}"/>
+<ds:datastoreItem xmlns:ds="http://schemas.openxmlformats.org/officeDocument/2006/customXml" ds:itemID="{11D8E319-16BF-4646-B1E7-C906A9C714FB}">
+  <ds:schemaRefs>
+    <ds:schemaRef ds:uri="http://schemas.microsoft.com/office/2006/metadata/contentType"/>
+    <ds:schemaRef ds:uri="http://schemas.microsoft.com/office/2006/metadata/properties/metaAttributes"/>
+    <ds:schemaRef ds:uri="http://www.w3.org/2001/XMLSchema"/>
+    <ds:schemaRef ds:uri="http://schemas.microsoft.com/office/2006/metadata/properties"/>
+    <ds:schemaRef ds:uri="3dd1c965-52c6-4487-92af-739379b659ac"/>
+    <ds:schemaRef ds:uri="e29f6279-0e28-4edd-8338-8230b9969525"/>
+    <ds:schemaRef ds:uri="http://schemas.microsoft.com/office/2006/documentManagement/types"/>
+    <ds:schemaRef ds:uri="http://schemas.microsoft.com/office/infopath/2007/PartnerControls"/>
+    <ds:schemaRef ds:uri="http://schemas.openxmlformats.org/package/2006/metadata/core-properties"/>
+    <ds:schemaRef ds:uri="http://purl.org/dc/elements/1.1/"/>
+    <ds:schemaRef ds:uri="http://purl.org/dc/terms/"/>
+    <ds:schemaRef ds:uri="http://schemas.microsoft.com/internal/obd"/>
+  </ds:schemaRefs>
+</ds:datastoreItem>
 </file>
 
 <file path=customXml/itemProps3.xml><?xml version="1.0" encoding="utf-8"?>

</xml_diff>

<commit_message>
Retroactively updated the change log with 2 changes missing
</commit_message>
<xml_diff>
--- a/analysis protocol.docx
+++ b/analysis protocol.docx
@@ -4,7 +4,7 @@
   <w:body>
     <w:p>
       <w:pPr>
-        <w:pStyle w:val="Title"/>
+        <w:pStyle w:val="Tittel"/>
         <w:rPr>
           <w:sz w:val="40"/>
           <w:szCs w:val="40"/>
@@ -38,7 +38,7 @@
     </w:p>
     <w:p>
       <w:pPr>
-        <w:pStyle w:val="Heading1"/>
+        <w:pStyle w:val="Overskrift1"/>
       </w:pPr>
       <w:r>
         <w:t>D</w:t>
@@ -62,7 +62,7 @@
     </w:p>
     <w:p>
       <w:pPr>
-        <w:pStyle w:val="ListParagraph"/>
+        <w:pStyle w:val="Listeavsnitt"/>
         <w:numPr>
           <w:ilvl w:val="0"/>
           <w:numId w:val="1"/>
@@ -80,7 +80,7 @@
     </w:p>
     <w:p>
       <w:pPr>
-        <w:pStyle w:val="ListParagraph"/>
+        <w:pStyle w:val="Listeavsnitt"/>
         <w:numPr>
           <w:ilvl w:val="0"/>
           <w:numId w:val="1"/>
@@ -89,24 +89,16 @@
           <w:lang w:val="en-US"/>
         </w:rPr>
       </w:pPr>
-      <w:proofErr w:type="spellStart"/>
-      <w:r>
-        <w:rPr>
-          <w:lang w:val="en-US"/>
-        </w:rPr>
-        <w:t>Chronbach</w:t>
-      </w:r>
-      <w:proofErr w:type="spellEnd"/>
-      <w:r>
-        <w:rPr>
-          <w:lang w:val="en-US"/>
-        </w:rPr>
-        <w:t xml:space="preserve"> alpha for each big-5 subscale</w:t>
-      </w:r>
-    </w:p>
-    <w:p>
-      <w:pPr>
-        <w:pStyle w:val="ListParagraph"/>
+      <w:r>
+        <w:rPr>
+          <w:lang w:val="en-US"/>
+        </w:rPr>
+        <w:t>Chronbach alpha for each big-5 subscale</w:t>
+      </w:r>
+    </w:p>
+    <w:p>
+      <w:pPr>
+        <w:pStyle w:val="Listeavsnitt"/>
         <w:numPr>
           <w:ilvl w:val="0"/>
           <w:numId w:val="1"/>
@@ -142,7 +134,7 @@
     </w:p>
     <w:p>
       <w:pPr>
-        <w:pStyle w:val="ListParagraph"/>
+        <w:pStyle w:val="Listeavsnitt"/>
         <w:numPr>
           <w:ilvl w:val="0"/>
           <w:numId w:val="1"/>
@@ -160,7 +152,7 @@
     </w:p>
     <w:p>
       <w:pPr>
-        <w:pStyle w:val="ListParagraph"/>
+        <w:pStyle w:val="Listeavsnitt"/>
         <w:numPr>
           <w:ilvl w:val="0"/>
           <w:numId w:val="1"/>
@@ -190,7 +182,7 @@
     </w:p>
     <w:p>
       <w:pPr>
-        <w:pStyle w:val="ListParagraph"/>
+        <w:pStyle w:val="Listeavsnitt"/>
         <w:numPr>
           <w:ilvl w:val="0"/>
           <w:numId w:val="1"/>
@@ -208,7 +200,7 @@
     </w:p>
     <w:p>
       <w:pPr>
-        <w:pStyle w:val="ListParagraph"/>
+        <w:pStyle w:val="Listeavsnitt"/>
         <w:numPr>
           <w:ilvl w:val="0"/>
           <w:numId w:val="1"/>
@@ -226,7 +218,7 @@
     </w:p>
     <w:p>
       <w:pPr>
-        <w:pStyle w:val="ListParagraph"/>
+        <w:pStyle w:val="Listeavsnitt"/>
         <w:numPr>
           <w:ilvl w:val="0"/>
           <w:numId w:val="1"/>
@@ -250,7 +242,7 @@
     </w:p>
     <w:p>
       <w:pPr>
-        <w:pStyle w:val="ListParagraph"/>
+        <w:pStyle w:val="Listeavsnitt"/>
         <w:numPr>
           <w:ilvl w:val="0"/>
           <w:numId w:val="1"/>
@@ -263,12 +255,24 @@
         <w:rPr>
           <w:lang w:val="en-US"/>
         </w:rPr>
-        <w:t>See if any of these behave differently for age or gender (interaction)</w:t>
-      </w:r>
-    </w:p>
-    <w:p>
-      <w:pPr>
-        <w:pStyle w:val="ListParagraph"/>
+        <w:t xml:space="preserve">Exploratory factor analysis </w:t>
+      </w:r>
+      <w:r>
+        <w:rPr>
+          <w:lang w:val="en-US"/>
+        </w:rPr>
+        <w:t>for</w:t>
+      </w:r>
+      <w:r>
+        <w:rPr>
+          <w:lang w:val="en-US"/>
+        </w:rPr>
+        <w:t xml:space="preserve"> Big-5</w:t>
+      </w:r>
+    </w:p>
+    <w:p>
+      <w:pPr>
+        <w:pStyle w:val="Listeavsnitt"/>
         <w:numPr>
           <w:ilvl w:val="0"/>
           <w:numId w:val="1"/>
@@ -281,36 +285,6 @@
         <w:rPr>
           <w:lang w:val="en-US"/>
         </w:rPr>
-        <w:t xml:space="preserve">Exploratory factor analysis with all 16 personalities and </w:t>
-      </w:r>
-      <w:r>
-        <w:rPr>
-          <w:lang w:val="en-US"/>
-        </w:rPr>
-        <w:t xml:space="preserve">all 5 </w:t>
-      </w:r>
-      <w:r>
-        <w:rPr>
-          <w:lang w:val="en-US"/>
-        </w:rPr>
-        <w:t>Big-5 subscales</w:t>
-      </w:r>
-    </w:p>
-    <w:p>
-      <w:pPr>
-        <w:pStyle w:val="ListParagraph"/>
-        <w:numPr>
-          <w:ilvl w:val="0"/>
-          <w:numId w:val="1"/>
-        </w:numPr>
-        <w:rPr>
-          <w:lang w:val="en-US"/>
-        </w:rPr>
-      </w:pPr>
-      <w:r>
-        <w:rPr>
-          <w:lang w:val="en-US"/>
-        </w:rPr>
         <w:t xml:space="preserve">Check distribution of MBTI dimensions for 2026, </w:t>
       </w:r>
       <w:r>
@@ -351,16 +325,24 @@
         </w:rPr>
         <w:t xml:space="preserve">An exploratory factor analysis will determine what </w:t>
       </w:r>
-      <w:r>
-        <w:rPr>
-          <w:lang w:val="en-US"/>
-        </w:rPr>
-        <w:t xml:space="preserve">dimensions that Big-5 and Myers-Briggs collectively describe. </w:t>
-      </w:r>
-    </w:p>
-    <w:p>
-      <w:pPr>
-        <w:pStyle w:val="Heading2"/>
+      <w:proofErr w:type="gramStart"/>
+      <w:r>
+        <w:rPr>
+          <w:lang w:val="en-US"/>
+        </w:rPr>
+        <w:t>dimensions that</w:t>
+      </w:r>
+      <w:proofErr w:type="gramEnd"/>
+      <w:r>
+        <w:rPr>
+          <w:lang w:val="en-US"/>
+        </w:rPr>
+        <w:t xml:space="preserve"> Big-5 and Myers-Briggs collectively describe. </w:t>
+      </w:r>
+    </w:p>
+    <w:p>
+      <w:pPr>
+        <w:pStyle w:val="Overskrift2"/>
         <w:rPr>
           <w:sz w:val="24"/>
           <w:szCs w:val="24"/>
@@ -389,7 +371,7 @@
       <w:hyperlink r:id="rId8">
         <w:r>
           <w:rPr>
-            <w:rStyle w:val="Hyperlink"/>
+            <w:rStyle w:val="Hyperkobling"/>
             <w:lang w:val="en-US"/>
           </w:rPr>
           <w:t>https://cosmin.nl/wp-content/uploads/COSMIN-definitions-domains-measurement-properties.pdf</w:t>
@@ -418,7 +400,21 @@
         <w:rPr>
           <w:lang w:val="en-US"/>
         </w:rPr>
-        <w:t>The big five versus the big four: the relationship between the Myers-Briggs Type Indicator (MBTI) and NEO-PI five factor model of personality</w:t>
+        <w:t xml:space="preserve">The big five versus the big four: the relationship between the Myers-Briggs Type Indicator (MBTI) and NEO-PI five factor </w:t>
+      </w:r>
+      <w:proofErr w:type="gramStart"/>
+      <w:r>
+        <w:rPr>
+          <w:lang w:val="en-US"/>
+        </w:rPr>
+        <w:t>model</w:t>
+      </w:r>
+      <w:proofErr w:type="gramEnd"/>
+      <w:r>
+        <w:rPr>
+          <w:lang w:val="en-US"/>
+        </w:rPr>
+        <w:t xml:space="preserve"> of personality</w:t>
       </w:r>
       <w:r>
         <w:rPr>
@@ -429,7 +425,7 @@
       <w:hyperlink r:id="rId9" w:tgtFrame="_blank" w:tooltip="Persistent link using digital object identifier" w:history="1">
         <w:r>
           <w:rPr>
-            <w:rStyle w:val="Hyperlink"/>
+            <w:rStyle w:val="Hyperkobling"/>
             <w:lang w:val="en-US"/>
           </w:rPr>
           <w:t>https://doi.org/10.1016/0191-8869(96)00033-5</w:t>
@@ -464,21 +460,7 @@
         <w:rPr>
           <w:lang w:val="en-US"/>
         </w:rPr>
-        <w:t xml:space="preserve">BFI </w:t>
-      </w:r>
-      <w:proofErr w:type="spellStart"/>
-      <w:r>
-        <w:rPr>
-          <w:lang w:val="en-US"/>
-        </w:rPr>
-        <w:t>extrovertedness</w:t>
-      </w:r>
-      <w:proofErr w:type="spellEnd"/>
-      <w:r>
-        <w:rPr>
-          <w:lang w:val="en-US"/>
-        </w:rPr>
-        <w:t xml:space="preserve"> versus receiving an Extrovert/Introvert (E/I) MBTI. </w:t>
+        <w:t xml:space="preserve">BFI extrovertedness versus receiving an Extrovert/Introvert (E/I) MBTI. </w:t>
       </w:r>
     </w:p>
     <w:p>
@@ -542,30 +524,67 @@
     </w:p>
     <w:p>
       <w:pPr>
-        <w:pStyle w:val="Heading1"/>
-      </w:pPr>
-      <w:r>
+        <w:pStyle w:val="Overskrift1"/>
+      </w:pPr>
+      <w:r>
+        <w:t>Within-study comparisons</w:t>
+      </w:r>
+    </w:p>
+    <w:p>
+      <w:pPr>
+        <w:rPr>
+          <w:lang w:val="en-US"/>
+        </w:rPr>
+      </w:pPr>
+      <w:r>
+        <w:rPr>
+          <w:lang w:val="en-US"/>
+        </w:rPr>
+        <w:t xml:space="preserve">The aim of this study is to understand whether having a grade-based admission process leads to random distributions of medical student personality. </w:t>
+      </w:r>
+      <w:r>
+        <w:rPr>
+          <w:lang w:val="en-US"/>
+        </w:rPr>
+        <w:t>If it is random, we would expect different personalities every semester. If it is non-random, we would see a pattern</w:t>
+      </w:r>
+      <w:r>
+        <w:rPr>
+          <w:lang w:val="en-US"/>
+        </w:rPr>
+        <w:t xml:space="preserve">. </w:t>
+      </w:r>
+    </w:p>
+    <w:p>
+      <w:pPr>
+        <w:rPr>
+          <w:lang w:val="en-US"/>
+        </w:rPr>
+      </w:pPr>
+      <w:r>
+        <w:rPr>
+          <w:lang w:val="en-US"/>
+        </w:rPr>
         <w:lastRenderedPageBreak/>
-        <w:t>Within-study comparisons</w:t>
-      </w:r>
-    </w:p>
-    <w:p>
-      <w:pPr>
-        <w:rPr>
-          <w:lang w:val="en-US"/>
-        </w:rPr>
-      </w:pPr>
-      <w:r>
-        <w:rPr>
-          <w:lang w:val="en-US"/>
-        </w:rPr>
-        <w:t xml:space="preserve">The aim of this study is to understand whether having a grade-based admission process leads to random distributions of medical student personality. </w:t>
-      </w:r>
-      <w:r>
-        <w:rPr>
-          <w:lang w:val="en-US"/>
-        </w:rPr>
-        <w:t>If it is random, we would expect different personalities every semester. If it is non-random, we would see a pattern</w:t>
+        <w:t>Hypothesis testing can quickly lead to many p-values</w:t>
+      </w:r>
+      <w:r>
+        <w:rPr>
+          <w:lang w:val="en-US"/>
+        </w:rPr>
+        <w:t xml:space="preserve">, with 5 big-5 subscale dimensions, 4 MBTI dimensions, and 4 cohorts to test against each other. We therefore choose to describe the time-trends with </w:t>
+      </w:r>
+      <w:r>
+        <w:rPr>
+          <w:lang w:val="en-US"/>
+        </w:rPr>
+        <w:t xml:space="preserve">parameter estimates and </w:t>
+      </w:r>
+      <w:r>
+        <w:rPr>
+          <w:lang w:val="en-US"/>
+        </w:rPr>
+        <w:t>surrounding confidence intervals</w:t>
       </w:r>
       <w:r>
         <w:rPr>
@@ -573,43 +592,6 @@
         </w:rPr>
         <w:t xml:space="preserve">. </w:t>
       </w:r>
-    </w:p>
-    <w:p>
-      <w:pPr>
-        <w:rPr>
-          <w:lang w:val="en-US"/>
-        </w:rPr>
-      </w:pPr>
-      <w:r>
-        <w:rPr>
-          <w:lang w:val="en-US"/>
-        </w:rPr>
-        <w:t>Hypothesis testing can quickly lead to many p-values</w:t>
-      </w:r>
-      <w:r>
-        <w:rPr>
-          <w:lang w:val="en-US"/>
-        </w:rPr>
-        <w:t xml:space="preserve">, with 5 big-5 subscale dimensions, 4 MBTI dimensions, and 4 cohorts to test against each other. We therefore choose to describe the time-trends with </w:t>
-      </w:r>
-      <w:r>
-        <w:rPr>
-          <w:lang w:val="en-US"/>
-        </w:rPr>
-        <w:t xml:space="preserve">parameter estimates and </w:t>
-      </w:r>
-      <w:r>
-        <w:rPr>
-          <w:lang w:val="en-US"/>
-        </w:rPr>
-        <w:t>surrounding confidence intervals</w:t>
-      </w:r>
-      <w:r>
-        <w:rPr>
-          <w:lang w:val="en-US"/>
-        </w:rPr>
-        <w:t xml:space="preserve">. </w:t>
-      </w:r>
       <w:r>
         <w:rPr>
           <w:lang w:val="en-US"/>
@@ -663,7 +645,7 @@
     </w:p>
     <w:p>
       <w:pPr>
-        <w:pStyle w:val="ListParagraph"/>
+        <w:pStyle w:val="Listeavsnitt"/>
         <w:numPr>
           <w:ilvl w:val="0"/>
           <w:numId w:val="1"/>
@@ -681,7 +663,7 @@
     </w:p>
     <w:p>
       <w:pPr>
-        <w:pStyle w:val="ListParagraph"/>
+        <w:pStyle w:val="Listeavsnitt"/>
         <w:numPr>
           <w:ilvl w:val="0"/>
           <w:numId w:val="1"/>
@@ -705,7 +687,7 @@
     </w:p>
     <w:p>
       <w:pPr>
-        <w:pStyle w:val="Heading1"/>
+        <w:pStyle w:val="Overskrift1"/>
       </w:pPr>
       <w:r>
         <w:t>Between-</w:t>
@@ -766,7 +748,7 @@
     </w:p>
     <w:p>
       <w:pPr>
-        <w:pStyle w:val="ListParagraph"/>
+        <w:pStyle w:val="Listeavsnitt"/>
         <w:numPr>
           <w:ilvl w:val="0"/>
           <w:numId w:val="1"/>
@@ -790,7 +772,7 @@
     </w:p>
     <w:p>
       <w:pPr>
-        <w:pStyle w:val="ListParagraph"/>
+        <w:pStyle w:val="Listeavsnitt"/>
         <w:numPr>
           <w:ilvl w:val="1"/>
           <w:numId w:val="1"/>
@@ -808,7 +790,7 @@
     </w:p>
     <w:p>
       <w:pPr>
-        <w:pStyle w:val="ListParagraph"/>
+        <w:pStyle w:val="Listeavsnitt"/>
         <w:numPr>
           <w:ilvl w:val="0"/>
           <w:numId w:val="1"/>
@@ -826,7 +808,7 @@
     </w:p>
     <w:p>
       <w:pPr>
-        <w:pStyle w:val="ListParagraph"/>
+        <w:pStyle w:val="Listeavsnitt"/>
         <w:numPr>
           <w:ilvl w:val="0"/>
           <w:numId w:val="1"/>
@@ -844,7 +826,7 @@
     </w:p>
     <w:p>
       <w:pPr>
-        <w:pStyle w:val="ListParagraph"/>
+        <w:pStyle w:val="Listeavsnitt"/>
         <w:numPr>
           <w:ilvl w:val="0"/>
           <w:numId w:val="1"/>
@@ -862,7 +844,7 @@
     </w:p>
     <w:p>
       <w:pPr>
-        <w:pStyle w:val="ListParagraph"/>
+        <w:pStyle w:val="Listeavsnitt"/>
         <w:numPr>
           <w:ilvl w:val="0"/>
           <w:numId w:val="1"/>
@@ -880,7 +862,7 @@
     </w:p>
     <w:p>
       <w:pPr>
-        <w:pStyle w:val="ListParagraph"/>
+        <w:pStyle w:val="Listeavsnitt"/>
         <w:numPr>
           <w:ilvl w:val="0"/>
           <w:numId w:val="1"/>
@@ -898,7 +880,7 @@
     </w:p>
     <w:p>
       <w:pPr>
-        <w:pStyle w:val="ListParagraph"/>
+        <w:pStyle w:val="Listeavsnitt"/>
         <w:numPr>
           <w:ilvl w:val="0"/>
           <w:numId w:val="1"/>
@@ -940,7 +922,7 @@
     </w:p>
     <w:p>
       <w:pPr>
-        <w:pStyle w:val="ListParagraph"/>
+        <w:pStyle w:val="Listeavsnitt"/>
         <w:numPr>
           <w:ilvl w:val="0"/>
           <w:numId w:val="1"/>
@@ -958,7 +940,7 @@
     </w:p>
     <w:p>
       <w:pPr>
-        <w:pStyle w:val="ListParagraph"/>
+        <w:pStyle w:val="Listeavsnitt"/>
         <w:numPr>
           <w:ilvl w:val="0"/>
           <w:numId w:val="1"/>
@@ -988,7 +970,7 @@
     </w:p>
     <w:p>
       <w:pPr>
-        <w:pStyle w:val="Heading1"/>
+        <w:pStyle w:val="Overskrift1"/>
       </w:pPr>
       <w:r>
         <w:t>Big Five Inventory</w:t>
@@ -996,7 +978,7 @@
     </w:p>
     <w:p>
       <w:pPr>
-        <w:pStyle w:val="Heading2"/>
+        <w:pStyle w:val="Overskrift2"/>
       </w:pPr>
       <w:r>
         <w:t>Current suggestion</w:t>
@@ -1034,23 +1016,13 @@
         </w:rPr>
         <w:t xml:space="preserve"> </w:t>
       </w:r>
-      <w:proofErr w:type="spellStart"/>
       <w:r>
         <w:rPr>
           <w:sz w:val="24"/>
           <w:szCs w:val="24"/>
           <w:lang w:val="en-US"/>
         </w:rPr>
-        <w:t>Plaisant</w:t>
-      </w:r>
-      <w:proofErr w:type="spellEnd"/>
-      <w:r>
-        <w:rPr>
-          <w:sz w:val="24"/>
-          <w:szCs w:val="24"/>
-          <w:lang w:val="en-US"/>
-        </w:rPr>
-        <w:t xml:space="preserve"> et al. 2011 French study</w:t>
+        <w:t>Plaisant et al. 2011 French study</w:t>
       </w:r>
       <w:r>
         <w:rPr>
@@ -1133,42 +1105,31 @@
           <w:szCs w:val="24"/>
           <w:lang w:val="en-US"/>
         </w:rPr>
-        <w:t xml:space="preserve"> World-wide norm population, Norwegian </w:t>
-      </w:r>
-      <w:proofErr w:type="spellStart"/>
+        <w:t xml:space="preserve"> World-wide norm population, Norwegian SHoT population </w:t>
+      </w:r>
       <w:r>
         <w:rPr>
           <w:sz w:val="24"/>
           <w:szCs w:val="24"/>
           <w:lang w:val="en-US"/>
         </w:rPr>
-        <w:t>SHoT</w:t>
-      </w:r>
-      <w:proofErr w:type="spellEnd"/>
-      <w:r>
-        <w:rPr>
-          <w:sz w:val="24"/>
-          <w:szCs w:val="24"/>
-          <w:lang w:val="en-US"/>
-        </w:rPr>
-        <w:t xml:space="preserve"> population </w:t>
-      </w:r>
-      <w:r>
-        <w:rPr>
-          <w:sz w:val="24"/>
-          <w:szCs w:val="24"/>
-          <w:lang w:val="en-US"/>
-        </w:rPr>
         <w:t>(unless we can gain access to raw data)</w:t>
       </w:r>
     </w:p>
     <w:p>
       <w:pPr>
-        <w:pStyle w:val="Heading2"/>
-      </w:pPr>
-      <w:r>
-        <w:lastRenderedPageBreak/>
-        <w:t>World-wide norm population</w:t>
+        <w:pStyle w:val="Overskrift2"/>
+      </w:pPr>
+      <w:r>
+        <w:t>World-</w:t>
+      </w:r>
+      <w:proofErr w:type="gramStart"/>
+      <w:r>
+        <w:t>wide norm</w:t>
+      </w:r>
+      <w:proofErr w:type="gramEnd"/>
+      <w:r>
+        <w:t xml:space="preserve"> population</w:t>
       </w:r>
     </w:p>
     <w:p>
@@ -1186,7 +1147,7 @@
       <w:hyperlink r:id="rId10">
         <w:r>
           <w:rPr>
-            <w:rStyle w:val="Hyperlink"/>
+            <w:rStyle w:val="Hyperkobling"/>
             <w:lang w:val="en-US"/>
           </w:rPr>
           <w:t>https://openpsychometrics.org/</w:t>
@@ -1209,53 +1170,46 @@
         <w:rPr>
           <w:lang w:val="en-US"/>
         </w:rPr>
-        <w:t xml:space="preserve">Pros: 19 000+ responses from all across the world, the raw data is available, allowing item-to-item comparisons, and opens the ability to check distributions before a potential t-test, ANOVA or linear interpolation. Can also report characteristics like age, gender and </w:t>
-      </w:r>
-      <w:proofErr w:type="spellStart"/>
-      <w:r>
-        <w:rPr>
-          <w:lang w:val="en-US"/>
-        </w:rPr>
-        <w:t>naitonality</w:t>
-      </w:r>
-      <w:proofErr w:type="spellEnd"/>
-      <w:r>
-        <w:rPr>
-          <w:lang w:val="en-US"/>
-        </w:rPr>
-        <w:t>. We can choose a nationality.</w:t>
-      </w:r>
-    </w:p>
-    <w:p>
-      <w:pPr>
-        <w:rPr>
-          <w:lang w:val="en-US"/>
-        </w:rPr>
-      </w:pPr>
-      <w:r>
-        <w:rPr>
-          <w:lang w:val="en-US"/>
-        </w:rPr>
-        <w:t xml:space="preserve">Cons: They used a 5-point </w:t>
-      </w:r>
-      <w:proofErr w:type="spellStart"/>
-      <w:r>
-        <w:rPr>
-          <w:lang w:val="en-US"/>
-        </w:rPr>
-        <w:t>likert</w:t>
-      </w:r>
-      <w:proofErr w:type="spellEnd"/>
-      <w:r>
-        <w:rPr>
-          <w:lang w:val="en-US"/>
-        </w:rPr>
-        <w:t xml:space="preserve"> scale, and the data are rather old (2014).</w:t>
-      </w:r>
-    </w:p>
-    <w:p>
-      <w:pPr>
-        <w:pStyle w:val="Heading2"/>
+        <w:t xml:space="preserve">Pros: 19 000+ responses from </w:t>
+      </w:r>
+      <w:proofErr w:type="gramStart"/>
+      <w:r>
+        <w:rPr>
+          <w:lang w:val="en-US"/>
+        </w:rPr>
+        <w:t>all across</w:t>
+      </w:r>
+      <w:proofErr w:type="gramEnd"/>
+      <w:r>
+        <w:rPr>
+          <w:lang w:val="en-US"/>
+        </w:rPr>
+        <w:t xml:space="preserve"> the world, the raw data is available, allowing item-to-item comparisons, and opens the ability to check distributions before a potential t-test, ANOVA or linear </w:t>
+      </w:r>
+      <w:r>
+        <w:rPr>
+          <w:lang w:val="en-US"/>
+        </w:rPr>
+        <w:lastRenderedPageBreak/>
+        <w:t>interpolation. Can also report characteristics like age, gender and naitonality. We can choose a nationality.</w:t>
+      </w:r>
+    </w:p>
+    <w:p>
+      <w:pPr>
+        <w:rPr>
+          <w:lang w:val="en-US"/>
+        </w:rPr>
+      </w:pPr>
+      <w:r>
+        <w:rPr>
+          <w:lang w:val="en-US"/>
+        </w:rPr>
+        <w:t>Cons: They used a 5-point likert scale, and the data are rather old (2014).</w:t>
+      </w:r>
+    </w:p>
+    <w:p>
+      <w:pPr>
+        <w:pStyle w:val="Overskrift2"/>
       </w:pPr>
       <w:r>
         <w:t>Norwegian studies</w:t>
@@ -1263,7 +1217,7 @@
     </w:p>
     <w:p>
       <w:pPr>
-        <w:pStyle w:val="Heading3"/>
+        <w:pStyle w:val="Overskrift3"/>
         <w:rPr>
           <w:lang w:val="en-US"/>
         </w:rPr>
@@ -1308,7 +1262,7 @@
       <w:hyperlink r:id="rId11" w:history="1">
         <w:r>
           <w:rPr>
-            <w:rStyle w:val="Hyperlink"/>
+            <w:rStyle w:val="Hyperkobling"/>
             <w:lang w:val="en-US"/>
           </w:rPr>
           <w:t>https://journals.sagepub.com/doi/10.1177/1029864917709519</w:t>
@@ -1342,7 +1296,7 @@
       <w:hyperlink r:id="rId12" w:anchor="bibr25-1029864917709519" w:history="1">
         <w:r>
           <w:rPr>
-            <w:rStyle w:val="Hyperlink"/>
+            <w:rStyle w:val="Hyperkobling"/>
             <w:lang w:val="en-US"/>
           </w:rPr>
           <w:t>Lappegård &amp; Veenstra, 2010</w:t>
@@ -1367,6 +1321,7 @@
         </w:rPr>
         <w:t xml:space="preserve">Pros: </w:t>
       </w:r>
+      <w:proofErr w:type="gramStart"/>
       <w:r>
         <w:rPr>
           <w:lang w:val="en-US"/>
@@ -1389,7 +1344,14 @@
         <w:rPr>
           <w:lang w:val="en-US"/>
         </w:rPr>
-        <w:t xml:space="preserve">, has used the same </w:t>
+        <w:t>,</w:t>
+      </w:r>
+      <w:proofErr w:type="gramEnd"/>
+      <w:r>
+        <w:rPr>
+          <w:lang w:val="en-US"/>
+        </w:rPr>
+        <w:t xml:space="preserve"> has used the same </w:t>
       </w:r>
       <w:r>
         <w:rPr>
@@ -1502,7 +1464,7 @@
     </w:p>
     <w:p>
       <w:pPr>
-        <w:pStyle w:val="Heading3"/>
+        <w:pStyle w:val="Overskrift3"/>
         <w:rPr>
           <w:lang w:val="en-US"/>
         </w:rPr>
@@ -1530,28 +1492,34 @@
         <w:rPr>
           <w:lang w:val="en-US"/>
         </w:rPr>
-        <w:t xml:space="preserve">They cited the BFI-20S tool, but when given access to the data, it appeared not to have used the same scale after all. </w:t>
-      </w:r>
-    </w:p>
-    <w:p>
-      <w:pPr>
-        <w:rPr>
-          <w:lang w:val="en-US"/>
-        </w:rPr>
-      </w:pPr>
-      <w:proofErr w:type="spellStart"/>
-      <w:r>
-        <w:rPr>
-          <w:lang w:val="en-US"/>
-        </w:rPr>
-        <w:t>Erevik</w:t>
-      </w:r>
-      <w:proofErr w:type="spellEnd"/>
-      <w:r>
-        <w:rPr>
-          <w:lang w:val="en-US"/>
-        </w:rPr>
-        <w:t xml:space="preserve"> et al. 2023</w:t>
+        <w:t xml:space="preserve">They cited the BFI-20S tool, but when given access to the data, it appeared </w:t>
+      </w:r>
+      <w:proofErr w:type="gramStart"/>
+      <w:r>
+        <w:rPr>
+          <w:lang w:val="en-US"/>
+        </w:rPr>
+        <w:t>not to</w:t>
+      </w:r>
+      <w:proofErr w:type="gramEnd"/>
+      <w:r>
+        <w:rPr>
+          <w:lang w:val="en-US"/>
+        </w:rPr>
+        <w:t xml:space="preserve"> have used the same scale after all. </w:t>
+      </w:r>
+    </w:p>
+    <w:p>
+      <w:pPr>
+        <w:rPr>
+          <w:lang w:val="en-US"/>
+        </w:rPr>
+      </w:pPr>
+      <w:r>
+        <w:rPr>
+          <w:lang w:val="en-US"/>
+        </w:rPr>
+        <w:t>Erevik et al. 2023</w:t>
       </w:r>
       <w:r>
         <w:rPr>
@@ -1574,7 +1542,7 @@
       <w:hyperlink r:id="rId13" w:history="1">
         <w:r>
           <w:rPr>
-            <w:rStyle w:val="Hyperlink"/>
+            <w:rStyle w:val="Hyperkobling"/>
             <w:lang w:val="en-US"/>
           </w:rPr>
           <w:t>https://www.sciencedirect.com/science/article/pii/S0191886923000387</w:t>
@@ -1668,7 +1636,7 @@
     </w:p>
     <w:p>
       <w:pPr>
-        <w:pStyle w:val="Heading2"/>
+        <w:pStyle w:val="Overskrift2"/>
       </w:pPr>
       <w:r>
         <w:t>Comparison with other nations</w:t>
@@ -1680,11 +1648,19 @@
           <w:lang w:val="en-US"/>
         </w:rPr>
       </w:pPr>
-      <w:r>
-        <w:rPr>
-          <w:lang w:val="en-US"/>
-        </w:rPr>
-        <w:t>To compare with studies from other nations</w:t>
+      <w:proofErr w:type="gramStart"/>
+      <w:r>
+        <w:rPr>
+          <w:lang w:val="en-US"/>
+        </w:rPr>
+        <w:t>To compare</w:t>
+      </w:r>
+      <w:proofErr w:type="gramEnd"/>
+      <w:r>
+        <w:rPr>
+          <w:lang w:val="en-US"/>
+        </w:rPr>
+        <w:t xml:space="preserve"> with studies from other nations</w:t>
       </w:r>
       <w:r>
         <w:rPr>
@@ -1704,14 +1680,12 @@
         </w:rPr>
         <w:t xml:space="preserve"> (developed for a Norwegian population). They have often used 10S or 44S, or the long form. To </w:t>
       </w:r>
-      <w:proofErr w:type="spellStart"/>
       <w:r>
         <w:rPr>
           <w:lang w:val="en-US"/>
         </w:rPr>
         <w:t>summarise</w:t>
       </w:r>
-      <w:proofErr w:type="spellEnd"/>
       <w:r>
         <w:rPr>
           <w:lang w:val="en-US"/>
@@ -1722,7 +1696,21 @@
         <w:rPr>
           <w:lang w:val="en-US"/>
         </w:rPr>
-        <w:t xml:space="preserve">calculated the mean across items, rather than a sum. </w:t>
+        <w:t xml:space="preserve">calculated the </w:t>
+      </w:r>
+      <w:proofErr w:type="gramStart"/>
+      <w:r>
+        <w:rPr>
+          <w:lang w:val="en-US"/>
+        </w:rPr>
+        <w:t>mean</w:t>
+      </w:r>
+      <w:proofErr w:type="gramEnd"/>
+      <w:r>
+        <w:rPr>
+          <w:lang w:val="en-US"/>
+        </w:rPr>
+        <w:t xml:space="preserve"> across items, rather than a sum. </w:t>
       </w:r>
       <w:r>
         <w:rPr>
@@ -1734,7 +1722,21 @@
         <w:rPr>
           <w:lang w:val="en-US"/>
         </w:rPr>
-        <w:t xml:space="preserve"> could still compare with them by taking the mean instead of the sum. </w:t>
+        <w:t xml:space="preserve"> could still compare with them by taking the </w:t>
+      </w:r>
+      <w:proofErr w:type="gramStart"/>
+      <w:r>
+        <w:rPr>
+          <w:lang w:val="en-US"/>
+        </w:rPr>
+        <w:t>mean</w:t>
+      </w:r>
+      <w:proofErr w:type="gramEnd"/>
+      <w:r>
+        <w:rPr>
+          <w:lang w:val="en-US"/>
+        </w:rPr>
+        <w:t xml:space="preserve"> instead of the sum. </w:t>
       </w:r>
     </w:p>
     <w:p>
@@ -1753,21 +1755,7 @@
         <w:rPr>
           <w:lang w:val="en-US"/>
         </w:rPr>
-        <w:t xml:space="preserve">is a 7-point </w:t>
-      </w:r>
-      <w:proofErr w:type="spellStart"/>
-      <w:r>
-        <w:rPr>
-          <w:lang w:val="en-US"/>
-        </w:rPr>
-        <w:t>likert</w:t>
-      </w:r>
-      <w:proofErr w:type="spellEnd"/>
-      <w:r>
-        <w:rPr>
-          <w:lang w:val="en-US"/>
-        </w:rPr>
-        <w:t xml:space="preserve"> scale, while </w:t>
+        <w:t xml:space="preserve">is a 7-point likert scale, while </w:t>
       </w:r>
       <w:r>
         <w:rPr>
@@ -1840,7 +1828,6 @@
         <w:rPr>
           <w:lang w:val="en-US"/>
         </w:rPr>
-        <w:lastRenderedPageBreak/>
         <w:t xml:space="preserve">We could still compare BFI with </w:t>
       </w:r>
       <w:r>
@@ -1882,7 +1869,7 @@
     </w:p>
     <w:p>
       <w:pPr>
-        <w:pStyle w:val="Heading3"/>
+        <w:pStyle w:val="Overskrift3"/>
         <w:rPr>
           <w:lang w:val="en-US"/>
         </w:rPr>
@@ -1939,7 +1926,7 @@
       <w:hyperlink r:id="rId14" w:history="1">
         <w:r>
           <w:rPr>
-            <w:rStyle w:val="Hyperlink"/>
+            <w:rStyle w:val="Hyperkobling"/>
             <w:lang w:val="en-US"/>
           </w:rPr>
           <w:t>https://bmcmededuc.biomedcentral.com/articles/10.1186/s12909-024-05434-x</w:t>
@@ -1962,6 +1949,7 @@
         <w:rPr>
           <w:lang w:val="en-US"/>
         </w:rPr>
+        <w:lastRenderedPageBreak/>
         <w:t xml:space="preserve">Pros: 7-point Likert scale. </w:t>
       </w:r>
       <w:r>
@@ -1992,7 +1980,21 @@
         <w:rPr>
           <w:lang w:val="en-US"/>
         </w:rPr>
-        <w:t>The final year of medical school, least comparable of all medical students.</w:t>
+        <w:t xml:space="preserve">The final year of medical school, least comparable </w:t>
+      </w:r>
+      <w:proofErr w:type="gramStart"/>
+      <w:r>
+        <w:rPr>
+          <w:lang w:val="en-US"/>
+        </w:rPr>
+        <w:t>of</w:t>
+      </w:r>
+      <w:proofErr w:type="gramEnd"/>
+      <w:r>
+        <w:rPr>
+          <w:lang w:val="en-US"/>
+        </w:rPr>
+        <w:t xml:space="preserve"> all medical students.</w:t>
       </w:r>
       <w:r>
         <w:rPr>
@@ -2016,7 +2018,21 @@
         <w:rPr>
           <w:lang w:val="en-US"/>
         </w:rPr>
-        <w:t xml:space="preserve"> this is based off of a larger study, but I couldn’t find it </w:t>
+        <w:t xml:space="preserve"> this is based </w:t>
+      </w:r>
+      <w:proofErr w:type="gramStart"/>
+      <w:r>
+        <w:rPr>
+          <w:lang w:val="en-US"/>
+        </w:rPr>
+        <w:t>off of</w:t>
+      </w:r>
+      <w:proofErr w:type="gramEnd"/>
+      <w:r>
+        <w:rPr>
+          <w:lang w:val="en-US"/>
+        </w:rPr>
+        <w:t xml:space="preserve"> a larger study, but I couldn’t find it </w:t>
       </w:r>
       <w:r>
         <w:rPr>
@@ -2033,24 +2049,16 @@
     </w:p>
     <w:p>
       <w:pPr>
-        <w:pStyle w:val="Heading3"/>
-        <w:rPr>
-          <w:lang w:val="en-US"/>
-        </w:rPr>
-      </w:pPr>
-      <w:proofErr w:type="spellStart"/>
-      <w:r>
-        <w:rPr>
-          <w:lang w:val="en-US"/>
-        </w:rPr>
-        <w:t>Plaisant</w:t>
-      </w:r>
-      <w:proofErr w:type="spellEnd"/>
-      <w:r>
-        <w:rPr>
-          <w:lang w:val="en-US"/>
-        </w:rPr>
-        <w:t xml:space="preserve"> et al. 2011</w:t>
+        <w:pStyle w:val="Overskrift3"/>
+        <w:rPr>
+          <w:lang w:val="en-US"/>
+        </w:rPr>
+      </w:pPr>
+      <w:r>
+        <w:rPr>
+          <w:lang w:val="en-US"/>
+        </w:rPr>
+        <w:t>Plaisant et al. 2011</w:t>
       </w:r>
       <w:r>
         <w:rPr>
@@ -2060,11 +2068,6 @@
       </w:r>
     </w:p>
     <w:p>
-      <w:pPr>
-        <w:rPr>
-          <w:lang w:val="en-US"/>
-        </w:rPr>
-      </w:pPr>
       <w:r>
         <w:rPr>
           <w:lang w:val="en-US"/>
@@ -2080,16 +2083,12 @@
       <w:hyperlink r:id="rId15">
         <w:r>
           <w:rPr>
-            <w:rStyle w:val="Hyperlink"/>
-            <w:lang w:val="en-US"/>
+            <w:rStyle w:val="Hyperkobling"/>
           </w:rPr>
           <w:t>https://www.researchgate.net/publication/215928596_Medical_students'_Big_Five_Personality_scores_and_the_effects_on_the_selection_process</w:t>
         </w:r>
       </w:hyperlink>
       <w:r>
-        <w:rPr>
-          <w:lang w:val="en-US"/>
-        </w:rPr>
         <w:t xml:space="preserve"> </w:t>
       </w:r>
     </w:p>
@@ -2163,7 +2162,7 @@
     </w:p>
     <w:p>
       <w:pPr>
-        <w:pStyle w:val="Heading3"/>
+        <w:pStyle w:val="Overskrift3"/>
         <w:rPr>
           <w:lang w:val="en-US"/>
         </w:rPr>
@@ -2202,7 +2201,7 @@
       <w:hyperlink r:id="rId16">
         <w:r>
           <w:rPr>
-            <w:rStyle w:val="Hyperlink"/>
+            <w:rStyle w:val="Hyperkobling"/>
             <w:lang w:val="en-US"/>
           </w:rPr>
           <w:t>https://doi.org/10.3109/0142159X.2013.827331</w:t>
@@ -2292,7 +2291,7 @@
       <w:hyperlink r:id="rId17">
         <w:r>
           <w:rPr>
-            <w:rStyle w:val="Hyperlink"/>
+            <w:rStyle w:val="Hyperkobling"/>
             <w:lang w:val="en-US"/>
           </w:rPr>
           <w:t>https://pmc.ncbi.nlm.nih.gov/articles/PMC11524645/</w:t>
@@ -2333,26 +2332,12 @@
         <w:rPr>
           <w:lang w:val="en-US"/>
         </w:rPr>
-        <w:t xml:space="preserve">Sedlar &amp; </w:t>
-      </w:r>
-      <w:proofErr w:type="spellStart"/>
-      <w:r>
-        <w:rPr>
-          <w:lang w:val="en-US"/>
-        </w:rPr>
-        <w:t>Gurnakova</w:t>
-      </w:r>
-      <w:proofErr w:type="spellEnd"/>
-      <w:r>
-        <w:rPr>
-          <w:lang w:val="en-US"/>
-        </w:rPr>
-        <w:t xml:space="preserve"> 2023. </w:t>
+        <w:t xml:space="preserve">Sedlar &amp; Gurnakova 2023. </w:t>
       </w:r>
       <w:hyperlink r:id="rId18">
         <w:r>
           <w:rPr>
-            <w:rStyle w:val="Hyperlink"/>
+            <w:rStyle w:val="Hyperkobling"/>
             <w:lang w:val="en-US"/>
           </w:rPr>
           <w:t>https://doi.org/10.1080/00223980.2024.2369618</w:t>
@@ -2410,21 +2395,21 @@
         <w:rPr>
           <w:lang w:val="en-US"/>
         </w:rPr>
-        <w:t>44-item version, but summed the subscales rather than averaged them (</w:t>
-      </w:r>
-      <w:proofErr w:type="spellStart"/>
-      <w:r>
-        <w:rPr>
-          <w:lang w:val="en-US"/>
-        </w:rPr>
-        <w:t>uncomparable</w:t>
-      </w:r>
-      <w:proofErr w:type="spellEnd"/>
-      <w:r>
-        <w:rPr>
-          <w:lang w:val="en-US"/>
-        </w:rPr>
-        <w:t>).</w:t>
+        <w:t xml:space="preserve">44-item </w:t>
+      </w:r>
+      <w:proofErr w:type="gramStart"/>
+      <w:r>
+        <w:rPr>
+          <w:lang w:val="en-US"/>
+        </w:rPr>
+        <w:t>version, but</w:t>
+      </w:r>
+      <w:proofErr w:type="gramEnd"/>
+      <w:r>
+        <w:rPr>
+          <w:lang w:val="en-US"/>
+        </w:rPr>
+        <w:t xml:space="preserve"> summed the subscales rather than averaged them (uncomparable).</w:t>
       </w:r>
       <w:r>
         <w:rPr>
@@ -2441,7 +2426,7 @@
       <w:hyperlink r:id="rId19">
         <w:r>
           <w:rPr>
-            <w:rStyle w:val="Hyperlink"/>
+            <w:rStyle w:val="Hyperkobling"/>
             <w:lang w:val="en-US"/>
           </w:rPr>
           <w:t>https://doi.org/10.1371/journal.pone.0321373</w:t>
@@ -2456,7 +2441,7 @@
     </w:p>
     <w:p>
       <w:pPr>
-        <w:pStyle w:val="Heading1"/>
+        <w:pStyle w:val="Overskrift1"/>
       </w:pPr>
       <w:r>
         <w:t>MBTI</w:t>
@@ -2464,7 +2449,7 @@
     </w:p>
     <w:p>
       <w:pPr>
-        <w:pStyle w:val="Heading2"/>
+        <w:pStyle w:val="Overskrift2"/>
       </w:pPr>
       <w:r>
         <w:t>Current suggestion</w:t>
@@ -2483,7 +2468,6 @@
           <w:szCs w:val="24"/>
         </w:rPr>
       </w:pPr>
-      <w:proofErr w:type="spellStart"/>
       <w:r>
         <w:rPr>
           <w:b/>
@@ -2491,9 +2475,30 @@
           <w:sz w:val="24"/>
           <w:szCs w:val="24"/>
         </w:rPr>
-        <w:t>Include</w:t>
-      </w:r>
-      <w:proofErr w:type="spellEnd"/>
+        <w:t>Include:</w:t>
+      </w:r>
+      <w:r>
+        <w:rPr>
+          <w:sz w:val="24"/>
+          <w:szCs w:val="24"/>
+        </w:rPr>
+        <w:t xml:space="preserve"> </w:t>
+      </w:r>
+      <w:r>
+        <w:rPr>
+          <w:sz w:val="24"/>
+          <w:szCs w:val="24"/>
+        </w:rPr>
+        <w:t>Krasner et al. 2024, Norwegian population</w:t>
+      </w:r>
+    </w:p>
+    <w:p>
+      <w:pPr>
+        <w:rPr>
+          <w:sz w:val="24"/>
+          <w:szCs w:val="24"/>
+        </w:rPr>
+      </w:pPr>
       <w:r>
         <w:rPr>
           <w:b/>
@@ -2501,7 +2506,7 @@
           <w:sz w:val="24"/>
           <w:szCs w:val="24"/>
         </w:rPr>
-        <w:t>:</w:t>
+        <w:t>Exclude:</w:t>
       </w:r>
       <w:r>
         <w:rPr>
@@ -2510,103 +2515,26 @@
         </w:rPr>
         <w:t xml:space="preserve"> </w:t>
       </w:r>
-      <w:proofErr w:type="spellStart"/>
       <w:r>
         <w:rPr>
           <w:sz w:val="24"/>
           <w:szCs w:val="24"/>
         </w:rPr>
-        <w:t>Krasner</w:t>
-      </w:r>
-      <w:proofErr w:type="spellEnd"/>
-      <w:r>
-        <w:rPr>
-          <w:sz w:val="24"/>
-          <w:szCs w:val="24"/>
-        </w:rPr>
-        <w:t xml:space="preserve"> et al. 2024, Norwegian </w:t>
-      </w:r>
-      <w:proofErr w:type="spellStart"/>
-      <w:r>
-        <w:rPr>
-          <w:sz w:val="24"/>
-          <w:szCs w:val="24"/>
-        </w:rPr>
-        <w:t>population</w:t>
-      </w:r>
-      <w:proofErr w:type="spellEnd"/>
-    </w:p>
-    <w:p>
-      <w:pPr>
-        <w:rPr>
-          <w:sz w:val="24"/>
-          <w:szCs w:val="24"/>
-        </w:rPr>
-      </w:pPr>
-      <w:proofErr w:type="spellStart"/>
-      <w:r>
-        <w:rPr>
-          <w:b/>
-          <w:bCs/>
-          <w:sz w:val="24"/>
-          <w:szCs w:val="24"/>
-        </w:rPr>
-        <w:t>Exclude</w:t>
-      </w:r>
-      <w:proofErr w:type="spellEnd"/>
-      <w:r>
-        <w:rPr>
-          <w:b/>
-          <w:bCs/>
-          <w:sz w:val="24"/>
-          <w:szCs w:val="24"/>
-        </w:rPr>
-        <w:t>:</w:t>
-      </w:r>
-      <w:r>
-        <w:rPr>
-          <w:sz w:val="24"/>
-          <w:szCs w:val="24"/>
-        </w:rPr>
-        <w:t xml:space="preserve"> </w:t>
-      </w:r>
-      <w:proofErr w:type="spellStart"/>
-      <w:r>
-        <w:rPr>
-          <w:sz w:val="24"/>
-          <w:szCs w:val="24"/>
-        </w:rPr>
-        <w:t>Tobieszewska</w:t>
-      </w:r>
-      <w:proofErr w:type="spellEnd"/>
-      <w:r>
-        <w:rPr>
-          <w:sz w:val="24"/>
-          <w:szCs w:val="24"/>
-        </w:rPr>
-        <w:t xml:space="preserve"> et al. 2024</w:t>
-      </w:r>
-    </w:p>
-    <w:p>
-      <w:pPr>
-        <w:pStyle w:val="Heading2"/>
+        <w:t>Tobieszewska et al. 2024</w:t>
+      </w:r>
+    </w:p>
+    <w:p>
+      <w:pPr>
+        <w:pStyle w:val="Overskrift2"/>
         <w:rPr>
           <w:lang w:val="nb-NO"/>
         </w:rPr>
       </w:pPr>
-      <w:proofErr w:type="spellStart"/>
       <w:r>
         <w:rPr>
           <w:lang w:val="nb-NO"/>
         </w:rPr>
-        <w:t>Krasner</w:t>
-      </w:r>
-      <w:proofErr w:type="spellEnd"/>
-      <w:r>
-        <w:rPr>
-          <w:lang w:val="nb-NO"/>
-        </w:rPr>
-        <w:t xml:space="preserve"> et al. 2024. </w:t>
+        <w:t xml:space="preserve">Krasner et al. 2024. </w:t>
       </w:r>
     </w:p>
     <w:p>
@@ -2630,7 +2558,7 @@
       <w:hyperlink r:id="rId20">
         <w:r>
           <w:rPr>
-            <w:rStyle w:val="Hyperlink"/>
+            <w:rStyle w:val="Hyperkobling"/>
             <w:lang w:val="en-US"/>
           </w:rPr>
           <w:t>https://bmcmededuc.biomedcentral.com/articles/10.1186/s12909-024-06297-y</w:t>
@@ -2653,7 +2581,6 @@
         <w:rPr>
           <w:lang w:val="en-US"/>
         </w:rPr>
-        <w:lastRenderedPageBreak/>
         <w:t xml:space="preserve">Pros: </w:t>
       </w:r>
       <w:r>
@@ -2703,7 +2630,21 @@
         <w:rPr>
           <w:lang w:val="en-US"/>
         </w:rPr>
-        <w:t>, not just first year</w:t>
+        <w:t xml:space="preserve">, not </w:t>
+      </w:r>
+      <w:proofErr w:type="gramStart"/>
+      <w:r>
+        <w:rPr>
+          <w:lang w:val="en-US"/>
+        </w:rPr>
+        <w:t>just</w:t>
+      </w:r>
+      <w:proofErr w:type="gramEnd"/>
+      <w:r>
+        <w:rPr>
+          <w:lang w:val="en-US"/>
+        </w:rPr>
+        <w:t xml:space="preserve"> first year</w:t>
       </w:r>
       <w:r>
         <w:rPr>
@@ -2714,7 +2655,7 @@
     </w:p>
     <w:p>
       <w:pPr>
-        <w:pStyle w:val="Heading2"/>
+        <w:pStyle w:val="Overskrift2"/>
       </w:pPr>
       <w:r>
         <w:t>Norwegian population</w:t>
@@ -2735,7 +2676,7 @@
       <w:hyperlink r:id="rId21" w:history="1">
         <w:r>
           <w:rPr>
-            <w:rStyle w:val="Hyperlink"/>
+            <w:rStyle w:val="Hyperkobling"/>
             <w:lang w:val="en-US"/>
           </w:rPr>
           <w:t>https://www.themyersbriggs.com/-/media/Myers-Briggs/Files/Manual-Supplements/MBTIGlobalManualSuppNOR.pdf</w:t>
@@ -2758,6 +2699,7 @@
         <w:rPr>
           <w:lang w:val="en-US"/>
         </w:rPr>
+        <w:lastRenderedPageBreak/>
         <w:t>Pros: Spread across Norway</w:t>
       </w:r>
       <w:r>
@@ -2859,15 +2801,10 @@
     </w:p>
     <w:p>
       <w:pPr>
-        <w:pStyle w:val="Heading2"/>
-      </w:pPr>
-      <w:proofErr w:type="spellStart"/>
-      <w:r>
-        <w:t>Tobieszewska</w:t>
-      </w:r>
-      <w:proofErr w:type="spellEnd"/>
-      <w:r>
-        <w:t xml:space="preserve"> et al. 2024.</w:t>
+        <w:pStyle w:val="Overskrift2"/>
+      </w:pPr>
+      <w:r>
+        <w:t>Tobieszewska et al. 2024.</w:t>
       </w:r>
       <w:r>
         <w:t xml:space="preserve"> (excluded)</w:t>
@@ -2888,7 +2825,7 @@
       <w:hyperlink r:id="rId22">
         <w:r>
           <w:rPr>
-            <w:rStyle w:val="Hyperlink"/>
+            <w:rStyle w:val="Hyperkobling"/>
             <w:lang w:val="en-US"/>
           </w:rPr>
           <w:t>https://www.i-jmr.org/2024/1/e60223</w:t>
@@ -2990,7 +2927,7 @@
     </w:p>
     <w:p>
       <w:pPr>
-        <w:pStyle w:val="Heading2"/>
+        <w:pStyle w:val="Overskrift2"/>
       </w:pPr>
       <w:r>
         <w:t>Change log</w:t>
@@ -3053,15 +2990,10 @@
       </w:r>
     </w:p>
     <w:p>
-      <w:pPr>
-        <w:rPr>
-          <w:lang w:val="en-US"/>
-        </w:rPr>
-      </w:pPr>
       <w:hyperlink r:id="rId23" w:history="1">
         <w:r>
           <w:rPr>
-            <w:rStyle w:val="Hyperlink"/>
+            <w:rStyle w:val="Hyperkobling"/>
           </w:rPr>
           <w:t>ODA Open Digital Archive: Norske soldaters personlighetstype, ernæringskompetanse og treningsaktivitet – en pilotstudie</w:t>
         </w:r>
@@ -3077,7 +3009,21 @@
         <w:rPr>
           <w:lang w:val="en-US"/>
         </w:rPr>
-        <w:t>They had also reported down to the detail of 16 MBTI types, no</w:t>
+        <w:t xml:space="preserve">They had also reported down to the </w:t>
+      </w:r>
+      <w:proofErr w:type="gramStart"/>
+      <w:r>
+        <w:rPr>
+          <w:lang w:val="en-US"/>
+        </w:rPr>
+        <w:t>detail</w:t>
+      </w:r>
+      <w:proofErr w:type="gramEnd"/>
+      <w:r>
+        <w:rPr>
+          <w:lang w:val="en-US"/>
+        </w:rPr>
+        <w:t xml:space="preserve"> of 16 MBTI types, no</w:t>
       </w:r>
       <w:r>
         <w:rPr>
@@ -3089,34 +3035,59 @@
         <w:rPr>
           <w:lang w:val="en-US"/>
         </w:rPr>
-        <w:t xml:space="preserve"> just the 4 dichotomies. We decided to compare with these as well.</w:t>
-      </w:r>
-    </w:p>
-    <w:p>
-      <w:pPr>
-        <w:rPr>
-          <w:lang w:val="en-US"/>
-        </w:rPr>
-      </w:pPr>
-      <w:r>
-        <w:rPr>
-          <w:lang w:val="en-US"/>
-        </w:rPr>
-        <w:t xml:space="preserve">In addition, for psychometric properties, we found it fruitful to consider the correlation matrix of Big-5 items to understand reliability in addition to the </w:t>
-      </w:r>
-      <w:proofErr w:type="spellStart"/>
-      <w:r>
-        <w:rPr>
-          <w:lang w:val="en-US"/>
-        </w:rPr>
-        <w:t>Chronbach</w:t>
-      </w:r>
-      <w:proofErr w:type="spellEnd"/>
-      <w:r>
-        <w:rPr>
-          <w:lang w:val="en-US"/>
-        </w:rPr>
-        <w:t xml:space="preserve">-alpha. </w:t>
+        <w:t xml:space="preserve"> just the 4 dichotomies. We decided to </w:t>
+      </w:r>
+      <w:proofErr w:type="gramStart"/>
+      <w:r>
+        <w:rPr>
+          <w:lang w:val="en-US"/>
+        </w:rPr>
+        <w:t>compare with these</w:t>
+      </w:r>
+      <w:proofErr w:type="gramEnd"/>
+      <w:r>
+        <w:rPr>
+          <w:lang w:val="en-US"/>
+        </w:rPr>
+        <w:t xml:space="preserve"> as well.</w:t>
+      </w:r>
+    </w:p>
+    <w:p>
+      <w:pPr>
+        <w:rPr>
+          <w:lang w:val="en-US"/>
+        </w:rPr>
+      </w:pPr>
+      <w:r>
+        <w:rPr>
+          <w:lang w:val="en-US"/>
+        </w:rPr>
+        <w:t xml:space="preserve">In addition, for psychometric properties, we found it fruitful to consider the correlation matrix of Big-5 items to understand reliability in addition to the Chronbach-alpha. </w:t>
+      </w:r>
+    </w:p>
+    <w:p>
+      <w:pPr>
+        <w:rPr>
+          <w:lang w:val="en-US"/>
+        </w:rPr>
+      </w:pPr>
+      <w:r>
+        <w:rPr>
+          <w:lang w:val="en-US"/>
+        </w:rPr>
+        <w:t>2025-10-22 Discovery of Hur et al. 2013. “</w:t>
+      </w:r>
+      <w:r>
+        <w:rPr>
+          <w:lang w:val="en-US"/>
+        </w:rPr>
+        <w:t>The characteristics of medical students' personality types and interpersonal needs</w:t>
+      </w:r>
+      <w:r>
+        <w:rPr>
+          <w:lang w:val="en-US"/>
+        </w:rPr>
+        <w:t>.” Korean medical students.</w:t>
       </w:r>
     </w:p>
     <w:p>
@@ -3135,27 +3106,41 @@
         <w:rPr>
           <w:lang w:val="en-US"/>
         </w:rPr>
-        <w:t xml:space="preserve">12-12 We found out the </w:t>
-      </w:r>
-      <w:proofErr w:type="spellStart"/>
-      <w:r>
-        <w:rPr>
-          <w:lang w:val="en-US"/>
-        </w:rPr>
-        <w:t>SHoT</w:t>
-      </w:r>
-      <w:proofErr w:type="spellEnd"/>
-      <w:r>
-        <w:rPr>
-          <w:lang w:val="en-US"/>
-        </w:rPr>
-        <w:t xml:space="preserve"> had rather misleading text about the questionnaire. They had not used the same as </w:t>
-      </w:r>
-      <w:r>
-        <w:rPr>
-          <w:lang w:val="en-US"/>
-        </w:rPr>
-        <w:t xml:space="preserve">the cited translation of Big-5, but been inspired by it. We chose not to compare with these data after all. </w:t>
+        <w:t xml:space="preserve">12-12 We found out the SHoT had rather misleading text about the questionnaire. They had not used the same as </w:t>
+      </w:r>
+      <w:r>
+        <w:rPr>
+          <w:lang w:val="en-US"/>
+        </w:rPr>
+        <w:t>the cited translation of Big-</w:t>
+      </w:r>
+      <w:proofErr w:type="gramStart"/>
+      <w:r>
+        <w:rPr>
+          <w:lang w:val="en-US"/>
+        </w:rPr>
+        <w:t>5, but</w:t>
+      </w:r>
+      <w:proofErr w:type="gramEnd"/>
+      <w:r>
+        <w:rPr>
+          <w:lang w:val="en-US"/>
+        </w:rPr>
+        <w:t xml:space="preserve"> been inspired by it. We chose not to compare with </w:t>
+      </w:r>
+      <w:proofErr w:type="gramStart"/>
+      <w:r>
+        <w:rPr>
+          <w:lang w:val="en-US"/>
+        </w:rPr>
+        <w:t>these</w:t>
+      </w:r>
+      <w:proofErr w:type="gramEnd"/>
+      <w:r>
+        <w:rPr>
+          <w:lang w:val="en-US"/>
+        </w:rPr>
+        <w:t xml:space="preserve"> data after all. </w:t>
       </w:r>
     </w:p>
     <w:p>
@@ -3175,6 +3160,47 @@
           <w:lang w:val="en-US"/>
         </w:rPr>
         <w:t>In addition, the degree of MBTI dimensions was collected. This allowed analyzing the degrees continuously, in the same manner as Big-5.</w:t>
+      </w:r>
+    </w:p>
+    <w:p>
+      <w:pPr>
+        <w:rPr>
+          <w:lang w:val="en-US"/>
+        </w:rPr>
+      </w:pPr>
+      <w:r>
+        <w:rPr>
+          <w:lang w:val="en-US"/>
+        </w:rPr>
+        <w:t xml:space="preserve">2026-02-13 We reduced the number of psychometric analyses. Interactions with age and gender have a high risk of false </w:t>
+      </w:r>
+      <w:proofErr w:type="gramStart"/>
+      <w:r>
+        <w:rPr>
+          <w:lang w:val="en-US"/>
+        </w:rPr>
+        <w:t>discovery, and</w:t>
+      </w:r>
+      <w:proofErr w:type="gramEnd"/>
+      <w:r>
+        <w:rPr>
+          <w:lang w:val="en-US"/>
+        </w:rPr>
+        <w:t xml:space="preserve"> were never performed. Exploratory factor analysis was only done on Big 5, where we have access to all items. Psychometrics </w:t>
+      </w:r>
+      <w:proofErr w:type="gramStart"/>
+      <w:r>
+        <w:rPr>
+          <w:lang w:val="en-US"/>
+        </w:rPr>
+        <w:t>were</w:t>
+      </w:r>
+      <w:proofErr w:type="gramEnd"/>
+      <w:r>
+        <w:rPr>
+          <w:lang w:val="en-US"/>
+        </w:rPr>
+        <w:t xml:space="preserve"> not the focus of the study. They were supposed to provide an assessment of data quality.</w:t>
       </w:r>
     </w:p>
     <w:p>
@@ -3938,11 +3964,11 @@
     <w:name w:val="Normal"/>
     <w:qFormat/>
   </w:style>
-  <w:style w:type="paragraph" w:styleId="Heading1">
+  <w:style w:type="paragraph" w:styleId="Overskrift1">
     <w:name w:val="heading 1"/>
     <w:basedOn w:val="Normal"/>
     <w:next w:val="Normal"/>
-    <w:link w:val="Heading1Char"/>
+    <w:link w:val="Overskrift1Tegn"/>
     <w:uiPriority w:val="9"/>
     <w:qFormat/>
     <w:rsid w:val="008C67FC"/>
@@ -3960,11 +3986,11 @@
       <w:lang w:val="en-US"/>
     </w:rPr>
   </w:style>
-  <w:style w:type="paragraph" w:styleId="Heading2">
+  <w:style w:type="paragraph" w:styleId="Overskrift2">
     <w:name w:val="heading 2"/>
     <w:basedOn w:val="Normal"/>
     <w:next w:val="Normal"/>
-    <w:link w:val="Heading2Char"/>
+    <w:link w:val="Overskrift2Tegn"/>
     <w:uiPriority w:val="9"/>
     <w:unhideWhenUsed/>
     <w:qFormat/>
@@ -3983,11 +4009,11 @@
       <w:lang w:val="en-US"/>
     </w:rPr>
   </w:style>
-  <w:style w:type="paragraph" w:styleId="Heading3">
+  <w:style w:type="paragraph" w:styleId="Overskrift3">
     <w:name w:val="heading 3"/>
     <w:basedOn w:val="Normal"/>
     <w:next w:val="Normal"/>
-    <w:link w:val="Heading3Char"/>
+    <w:link w:val="Overskrift3Tegn"/>
     <w:uiPriority w:val="9"/>
     <w:unhideWhenUsed/>
     <w:qFormat/>
@@ -4005,11 +4031,11 @@
       <w:szCs w:val="24"/>
     </w:rPr>
   </w:style>
-  <w:style w:type="paragraph" w:styleId="Heading4">
+  <w:style w:type="paragraph" w:styleId="Overskrift4">
     <w:name w:val="heading 4"/>
     <w:basedOn w:val="Normal"/>
     <w:next w:val="Normal"/>
-    <w:link w:val="Heading4Char"/>
+    <w:link w:val="Overskrift4Tegn"/>
     <w:uiPriority w:val="9"/>
     <w:semiHidden/>
     <w:unhideWhenUsed/>
@@ -4028,11 +4054,11 @@
       <w:color w:val="2F5496" w:themeColor="accent1" w:themeShade="BF"/>
     </w:rPr>
   </w:style>
-  <w:style w:type="paragraph" w:styleId="Heading5">
+  <w:style w:type="paragraph" w:styleId="Overskrift5">
     <w:name w:val="heading 5"/>
     <w:basedOn w:val="Normal"/>
     <w:next w:val="Normal"/>
-    <w:link w:val="Heading5Char"/>
+    <w:link w:val="Overskrift5Tegn"/>
     <w:uiPriority w:val="9"/>
     <w:semiHidden/>
     <w:unhideWhenUsed/>
@@ -4049,11 +4075,11 @@
       <w:color w:val="2F5496" w:themeColor="accent1" w:themeShade="BF"/>
     </w:rPr>
   </w:style>
-  <w:style w:type="paragraph" w:styleId="Heading6">
+  <w:style w:type="paragraph" w:styleId="Overskrift6">
     <w:name w:val="heading 6"/>
     <w:basedOn w:val="Normal"/>
     <w:next w:val="Normal"/>
-    <w:link w:val="Heading6Char"/>
+    <w:link w:val="Overskrift6Tegn"/>
     <w:uiPriority w:val="9"/>
     <w:semiHidden/>
     <w:unhideWhenUsed/>
@@ -4072,11 +4098,11 @@
       <w:color w:val="595959" w:themeColor="text1" w:themeTint="A6"/>
     </w:rPr>
   </w:style>
-  <w:style w:type="paragraph" w:styleId="Heading7">
+  <w:style w:type="paragraph" w:styleId="Overskrift7">
     <w:name w:val="heading 7"/>
     <w:basedOn w:val="Normal"/>
     <w:next w:val="Normal"/>
-    <w:link w:val="Heading7Char"/>
+    <w:link w:val="Overskrift7Tegn"/>
     <w:uiPriority w:val="9"/>
     <w:semiHidden/>
     <w:unhideWhenUsed/>
@@ -4093,11 +4119,11 @@
       <w:color w:val="595959" w:themeColor="text1" w:themeTint="A6"/>
     </w:rPr>
   </w:style>
-  <w:style w:type="paragraph" w:styleId="Heading8">
+  <w:style w:type="paragraph" w:styleId="Overskrift8">
     <w:name w:val="heading 8"/>
     <w:basedOn w:val="Normal"/>
     <w:next w:val="Normal"/>
-    <w:link w:val="Heading8Char"/>
+    <w:link w:val="Overskrift8Tegn"/>
     <w:uiPriority w:val="9"/>
     <w:semiHidden/>
     <w:unhideWhenUsed/>
@@ -4116,11 +4142,11 @@
       <w:color w:val="272727" w:themeColor="text1" w:themeTint="D8"/>
     </w:rPr>
   </w:style>
-  <w:style w:type="paragraph" w:styleId="Heading9">
+  <w:style w:type="paragraph" w:styleId="Overskrift9">
     <w:name w:val="heading 9"/>
     <w:basedOn w:val="Normal"/>
     <w:next w:val="Normal"/>
-    <w:link w:val="Heading9Char"/>
+    <w:link w:val="Overskrift9Tegn"/>
     <w:uiPriority w:val="9"/>
     <w:semiHidden/>
     <w:unhideWhenUsed/>
@@ -4137,13 +4163,13 @@
       <w:color w:val="272727" w:themeColor="text1" w:themeTint="D8"/>
     </w:rPr>
   </w:style>
-  <w:style w:type="character" w:default="1" w:styleId="DefaultParagraphFont">
+  <w:style w:type="character" w:default="1" w:styleId="Standardskriftforavsnitt">
     <w:name w:val="Default Paragraph Font"/>
     <w:uiPriority w:val="1"/>
     <w:semiHidden/>
     <w:unhideWhenUsed/>
   </w:style>
-  <w:style w:type="table" w:default="1" w:styleId="TableNormal">
+  <w:style w:type="table" w:default="1" w:styleId="Vanligtabell">
     <w:name w:val="Normal Table"/>
     <w:uiPriority w:val="99"/>
     <w:semiHidden/>
@@ -4158,16 +4184,16 @@
       </w:tblCellMar>
     </w:tblPr>
   </w:style>
-  <w:style w:type="numbering" w:default="1" w:styleId="NoList">
+  <w:style w:type="numbering" w:default="1" w:styleId="Ingenliste">
     <w:name w:val="No List"/>
     <w:uiPriority w:val="99"/>
     <w:semiHidden/>
     <w:unhideWhenUsed/>
   </w:style>
-  <w:style w:type="character" w:customStyle="1" w:styleId="Heading1Char">
-    <w:name w:val="Heading 1 Char"/>
-    <w:basedOn w:val="DefaultParagraphFont"/>
-    <w:link w:val="Heading1"/>
+  <w:style w:type="character" w:customStyle="1" w:styleId="Overskrift1Tegn">
+    <w:name w:val="Overskrift 1 Tegn"/>
+    <w:basedOn w:val="Standardskriftforavsnitt"/>
+    <w:link w:val="Overskrift1"/>
     <w:uiPriority w:val="9"/>
     <w:rsid w:val="008C67FC"/>
     <w:rPr>
@@ -4178,10 +4204,10 @@
       <w:lang w:val="en-US"/>
     </w:rPr>
   </w:style>
-  <w:style w:type="character" w:customStyle="1" w:styleId="Heading2Char">
-    <w:name w:val="Heading 2 Char"/>
-    <w:basedOn w:val="DefaultParagraphFont"/>
-    <w:link w:val="Heading2"/>
+  <w:style w:type="character" w:customStyle="1" w:styleId="Overskrift2Tegn">
+    <w:name w:val="Overskrift 2 Tegn"/>
+    <w:basedOn w:val="Standardskriftforavsnitt"/>
+    <w:link w:val="Overskrift2"/>
     <w:uiPriority w:val="9"/>
     <w:rsid w:val="008C67FC"/>
     <w:rPr>
@@ -4192,10 +4218,10 @@
       <w:lang w:val="en-US"/>
     </w:rPr>
   </w:style>
-  <w:style w:type="character" w:customStyle="1" w:styleId="Heading3Char">
-    <w:name w:val="Heading 3 Char"/>
-    <w:basedOn w:val="DefaultParagraphFont"/>
-    <w:link w:val="Heading3"/>
+  <w:style w:type="character" w:customStyle="1" w:styleId="Overskrift3Tegn">
+    <w:name w:val="Overskrift 3 Tegn"/>
+    <w:basedOn w:val="Standardskriftforavsnitt"/>
+    <w:link w:val="Overskrift3"/>
     <w:uiPriority w:val="9"/>
     <w:rsid w:val="008C67FC"/>
     <w:rPr>
@@ -4205,10 +4231,10 @@
       <w:szCs w:val="24"/>
     </w:rPr>
   </w:style>
-  <w:style w:type="character" w:customStyle="1" w:styleId="Heading4Char">
-    <w:name w:val="Heading 4 Char"/>
-    <w:basedOn w:val="DefaultParagraphFont"/>
-    <w:link w:val="Heading4"/>
+  <w:style w:type="character" w:customStyle="1" w:styleId="Overskrift4Tegn">
+    <w:name w:val="Overskrift 4 Tegn"/>
+    <w:basedOn w:val="Standardskriftforavsnitt"/>
+    <w:link w:val="Overskrift4"/>
     <w:uiPriority w:val="9"/>
     <w:semiHidden/>
     <w:rsid w:val="00CC4503"/>
@@ -4219,10 +4245,10 @@
       <w:color w:val="2F5496" w:themeColor="accent1" w:themeShade="BF"/>
     </w:rPr>
   </w:style>
-  <w:style w:type="character" w:customStyle="1" w:styleId="Heading5Char">
-    <w:name w:val="Heading 5 Char"/>
-    <w:basedOn w:val="DefaultParagraphFont"/>
-    <w:link w:val="Heading5"/>
+  <w:style w:type="character" w:customStyle="1" w:styleId="Overskrift5Tegn">
+    <w:name w:val="Overskrift 5 Tegn"/>
+    <w:basedOn w:val="Standardskriftforavsnitt"/>
+    <w:link w:val="Overskrift5"/>
     <w:uiPriority w:val="9"/>
     <w:semiHidden/>
     <w:rsid w:val="00CC4503"/>
@@ -4231,10 +4257,10 @@
       <w:color w:val="2F5496" w:themeColor="accent1" w:themeShade="BF"/>
     </w:rPr>
   </w:style>
-  <w:style w:type="character" w:customStyle="1" w:styleId="Heading6Char">
-    <w:name w:val="Heading 6 Char"/>
-    <w:basedOn w:val="DefaultParagraphFont"/>
-    <w:link w:val="Heading6"/>
+  <w:style w:type="character" w:customStyle="1" w:styleId="Overskrift6Tegn">
+    <w:name w:val="Overskrift 6 Tegn"/>
+    <w:basedOn w:val="Standardskriftforavsnitt"/>
+    <w:link w:val="Overskrift6"/>
     <w:uiPriority w:val="9"/>
     <w:semiHidden/>
     <w:rsid w:val="00CC4503"/>
@@ -4245,10 +4271,10 @@
       <w:color w:val="595959" w:themeColor="text1" w:themeTint="A6"/>
     </w:rPr>
   </w:style>
-  <w:style w:type="character" w:customStyle="1" w:styleId="Heading7Char">
-    <w:name w:val="Heading 7 Char"/>
-    <w:basedOn w:val="DefaultParagraphFont"/>
-    <w:link w:val="Heading7"/>
+  <w:style w:type="character" w:customStyle="1" w:styleId="Overskrift7Tegn">
+    <w:name w:val="Overskrift 7 Tegn"/>
+    <w:basedOn w:val="Standardskriftforavsnitt"/>
+    <w:link w:val="Overskrift7"/>
     <w:uiPriority w:val="9"/>
     <w:semiHidden/>
     <w:rsid w:val="00CC4503"/>
@@ -4257,10 +4283,10 @@
       <w:color w:val="595959" w:themeColor="text1" w:themeTint="A6"/>
     </w:rPr>
   </w:style>
-  <w:style w:type="character" w:customStyle="1" w:styleId="Heading8Char">
-    <w:name w:val="Heading 8 Char"/>
-    <w:basedOn w:val="DefaultParagraphFont"/>
-    <w:link w:val="Heading8"/>
+  <w:style w:type="character" w:customStyle="1" w:styleId="Overskrift8Tegn">
+    <w:name w:val="Overskrift 8 Tegn"/>
+    <w:basedOn w:val="Standardskriftforavsnitt"/>
+    <w:link w:val="Overskrift8"/>
     <w:uiPriority w:val="9"/>
     <w:semiHidden/>
     <w:rsid w:val="00CC4503"/>
@@ -4271,10 +4297,10 @@
       <w:color w:val="272727" w:themeColor="text1" w:themeTint="D8"/>
     </w:rPr>
   </w:style>
-  <w:style w:type="character" w:customStyle="1" w:styleId="Heading9Char">
-    <w:name w:val="Heading 9 Char"/>
-    <w:basedOn w:val="DefaultParagraphFont"/>
-    <w:link w:val="Heading9"/>
+  <w:style w:type="character" w:customStyle="1" w:styleId="Overskrift9Tegn">
+    <w:name w:val="Overskrift 9 Tegn"/>
+    <w:basedOn w:val="Standardskriftforavsnitt"/>
+    <w:link w:val="Overskrift9"/>
     <w:uiPriority w:val="9"/>
     <w:semiHidden/>
     <w:rsid w:val="00CC4503"/>
@@ -4283,11 +4309,11 @@
       <w:color w:val="272727" w:themeColor="text1" w:themeTint="D8"/>
     </w:rPr>
   </w:style>
-  <w:style w:type="paragraph" w:styleId="Title">
+  <w:style w:type="paragraph" w:styleId="Tittel">
     <w:name w:val="Title"/>
     <w:basedOn w:val="Normal"/>
     <w:next w:val="Normal"/>
-    <w:link w:val="TitleChar"/>
+    <w:link w:val="TittelTegn"/>
     <w:uiPriority w:val="10"/>
     <w:qFormat/>
     <w:rsid w:val="00CC4503"/>
@@ -4303,10 +4329,10 @@
       <w:szCs w:val="56"/>
     </w:rPr>
   </w:style>
-  <w:style w:type="character" w:customStyle="1" w:styleId="TitleChar">
-    <w:name w:val="Title Char"/>
-    <w:basedOn w:val="DefaultParagraphFont"/>
-    <w:link w:val="Title"/>
+  <w:style w:type="character" w:customStyle="1" w:styleId="TittelTegn">
+    <w:name w:val="Tittel Tegn"/>
+    <w:basedOn w:val="Standardskriftforavsnitt"/>
+    <w:link w:val="Tittel"/>
     <w:uiPriority w:val="10"/>
     <w:rsid w:val="00CC4503"/>
     <w:rPr>
@@ -4317,11 +4343,11 @@
       <w:szCs w:val="56"/>
     </w:rPr>
   </w:style>
-  <w:style w:type="paragraph" w:styleId="Subtitle">
+  <w:style w:type="paragraph" w:styleId="Undertittel">
     <w:name w:val="Subtitle"/>
     <w:basedOn w:val="Normal"/>
     <w:next w:val="Normal"/>
-    <w:link w:val="SubtitleChar"/>
+    <w:link w:val="UndertittelTegn"/>
     <w:uiPriority w:val="11"/>
     <w:qFormat/>
     <w:rsid w:val="00CC4503"/>
@@ -4338,10 +4364,10 @@
       <w:szCs w:val="28"/>
     </w:rPr>
   </w:style>
-  <w:style w:type="character" w:customStyle="1" w:styleId="SubtitleChar">
-    <w:name w:val="Subtitle Char"/>
-    <w:basedOn w:val="DefaultParagraphFont"/>
-    <w:link w:val="Subtitle"/>
+  <w:style w:type="character" w:customStyle="1" w:styleId="UndertittelTegn">
+    <w:name w:val="Undertittel Tegn"/>
+    <w:basedOn w:val="Standardskriftforavsnitt"/>
+    <w:link w:val="Undertittel"/>
     <w:uiPriority w:val="11"/>
     <w:rsid w:val="00CC4503"/>
     <w:rPr>
@@ -4352,11 +4378,11 @@
       <w:szCs w:val="28"/>
     </w:rPr>
   </w:style>
-  <w:style w:type="paragraph" w:styleId="Quote">
+  <w:style w:type="paragraph" w:styleId="Sitat">
     <w:name w:val="Quote"/>
     <w:basedOn w:val="Normal"/>
     <w:next w:val="Normal"/>
-    <w:link w:val="QuoteChar"/>
+    <w:link w:val="SitatTegn"/>
     <w:uiPriority w:val="29"/>
     <w:qFormat/>
     <w:rsid w:val="00CC4503"/>
@@ -4370,10 +4396,10 @@
       <w:color w:val="404040" w:themeColor="text1" w:themeTint="BF"/>
     </w:rPr>
   </w:style>
-  <w:style w:type="character" w:customStyle="1" w:styleId="QuoteChar">
-    <w:name w:val="Quote Char"/>
-    <w:basedOn w:val="DefaultParagraphFont"/>
-    <w:link w:val="Quote"/>
+  <w:style w:type="character" w:customStyle="1" w:styleId="SitatTegn">
+    <w:name w:val="Sitat Tegn"/>
+    <w:basedOn w:val="Standardskriftforavsnitt"/>
+    <w:link w:val="Sitat"/>
     <w:uiPriority w:val="29"/>
     <w:rsid w:val="00CC4503"/>
     <w:rPr>
@@ -4382,7 +4408,7 @@
       <w:color w:val="404040" w:themeColor="text1" w:themeTint="BF"/>
     </w:rPr>
   </w:style>
-  <w:style w:type="paragraph" w:styleId="ListParagraph">
+  <w:style w:type="paragraph" w:styleId="Listeavsnitt">
     <w:name w:val="List Paragraph"/>
     <w:basedOn w:val="Normal"/>
     <w:uiPriority w:val="34"/>
@@ -4393,9 +4419,9 @@
       <w:contextualSpacing/>
     </w:pPr>
   </w:style>
-  <w:style w:type="character" w:styleId="IntenseEmphasis">
+  <w:style w:type="character" w:styleId="Sterkutheving">
     <w:name w:val="Intense Emphasis"/>
-    <w:basedOn w:val="DefaultParagraphFont"/>
+    <w:basedOn w:val="Standardskriftforavsnitt"/>
     <w:uiPriority w:val="21"/>
     <w:qFormat/>
     <w:rsid w:val="00CC4503"/>
@@ -4405,11 +4431,11 @@
       <w:color w:val="2F5496" w:themeColor="accent1" w:themeShade="BF"/>
     </w:rPr>
   </w:style>
-  <w:style w:type="paragraph" w:styleId="IntenseQuote">
+  <w:style w:type="paragraph" w:styleId="Sterktsitat">
     <w:name w:val="Intense Quote"/>
     <w:basedOn w:val="Normal"/>
     <w:next w:val="Normal"/>
-    <w:link w:val="IntenseQuoteChar"/>
+    <w:link w:val="SterktsitatTegn"/>
     <w:uiPriority w:val="30"/>
     <w:qFormat/>
     <w:rsid w:val="00CC4503"/>
@@ -4428,10 +4454,10 @@
       <w:color w:val="2F5496" w:themeColor="accent1" w:themeShade="BF"/>
     </w:rPr>
   </w:style>
-  <w:style w:type="character" w:customStyle="1" w:styleId="IntenseQuoteChar">
-    <w:name w:val="Intense Quote Char"/>
-    <w:basedOn w:val="DefaultParagraphFont"/>
-    <w:link w:val="IntenseQuote"/>
+  <w:style w:type="character" w:customStyle="1" w:styleId="SterktsitatTegn">
+    <w:name w:val="Sterkt sitat Tegn"/>
+    <w:basedOn w:val="Standardskriftforavsnitt"/>
+    <w:link w:val="Sterktsitat"/>
     <w:uiPriority w:val="30"/>
     <w:rsid w:val="00CC4503"/>
     <w:rPr>
@@ -4440,9 +4466,9 @@
       <w:color w:val="2F5496" w:themeColor="accent1" w:themeShade="BF"/>
     </w:rPr>
   </w:style>
-  <w:style w:type="character" w:styleId="IntenseReference">
+  <w:style w:type="character" w:styleId="Sterkreferanse">
     <w:name w:val="Intense Reference"/>
-    <w:basedOn w:val="DefaultParagraphFont"/>
+    <w:basedOn w:val="Standardskriftforavsnitt"/>
     <w:uiPriority w:val="32"/>
     <w:qFormat/>
     <w:rsid w:val="00CC4503"/>
@@ -4454,9 +4480,9 @@
       <w:spacing w:val="5"/>
     </w:rPr>
   </w:style>
-  <w:style w:type="character" w:styleId="Hyperlink">
+  <w:style w:type="character" w:styleId="Hyperkobling">
     <w:name w:val="Hyperlink"/>
-    <w:basedOn w:val="DefaultParagraphFont"/>
+    <w:basedOn w:val="Standardskriftforavsnitt"/>
     <w:uiPriority w:val="99"/>
     <w:unhideWhenUsed/>
     <w:rsid w:val="00CC4503"/>
@@ -4465,9 +4491,9 @@
       <w:u w:val="single"/>
     </w:rPr>
   </w:style>
-  <w:style w:type="character" w:styleId="UnresolvedMention">
+  <w:style w:type="character" w:styleId="Ulstomtale">
     <w:name w:val="Unresolved Mention"/>
-    <w:basedOn w:val="DefaultParagraphFont"/>
+    <w:basedOn w:val="Standardskriftforavsnitt"/>
     <w:uiPriority w:val="99"/>
     <w:semiHidden/>
     <w:unhideWhenUsed/>
@@ -4477,9 +4503,9 @@
       <w:shd w:val="clear" w:color="auto" w:fill="E1DFDD"/>
     </w:rPr>
   </w:style>
-  <w:style w:type="character" w:styleId="FollowedHyperlink">
+  <w:style w:type="character" w:styleId="Fulgthyperkobling">
     <w:name w:val="FollowedHyperlink"/>
-    <w:basedOn w:val="DefaultParagraphFont"/>
+    <w:basedOn w:val="Standardskriftforavsnitt"/>
     <w:uiPriority w:val="99"/>
     <w:semiHidden/>
     <w:unhideWhenUsed/>
@@ -4788,14 +4814,12 @@
 </file>
 
 <file path=customXml/item1.xml><?xml version="1.0" encoding="utf-8"?>
-<p:properties xmlns:p="http://schemas.microsoft.com/office/2006/metadata/properties" xmlns:xsi="http://www.w3.org/2001/XMLSchema-instance" xmlns:pc="http://schemas.microsoft.com/office/infopath/2007/PartnerControls">
-  <documentManagement>
-    <lcf76f155ced4ddcb4097134ff3c332f xmlns="3dd1c965-52c6-4487-92af-739379b659ac">
-      <Terms xmlns="http://schemas.microsoft.com/office/infopath/2007/PartnerControls"/>
-    </lcf76f155ced4ddcb4097134ff3c332f>
-    <TaxCatchAll xmlns="e29f6279-0e28-4edd-8338-8230b9969525" xsi:nil="true"/>
-  </documentManagement>
-</p:properties>
+<?mso-contentType ?>
+<FormTemplates xmlns="http://schemas.microsoft.com/sharepoint/v3/contenttype/forms">
+  <Display>DocumentLibraryForm</Display>
+  <Edit>DocumentLibraryForm</Edit>
+  <New>DocumentLibraryForm</New>
+</FormTemplates>
 </file>
 
 <file path=customXml/item2.xml><?xml version="1.0" encoding="utf-8"?>
@@ -4988,21 +5012,20 @@
 </file>
 
 <file path=customXml/item3.xml><?xml version="1.0" encoding="utf-8"?>
-<?mso-contentType ?>
-<FormTemplates xmlns="http://schemas.microsoft.com/sharepoint/v3/contenttype/forms">
-  <Display>DocumentLibraryForm</Display>
-  <Edit>DocumentLibraryForm</Edit>
-  <New>DocumentLibraryForm</New>
-</FormTemplates>
+<p:properties xmlns:p="http://schemas.microsoft.com/office/2006/metadata/properties" xmlns:xsi="http://www.w3.org/2001/XMLSchema-instance" xmlns:pc="http://schemas.microsoft.com/office/infopath/2007/PartnerControls">
+  <documentManagement>
+    <lcf76f155ced4ddcb4097134ff3c332f xmlns="3dd1c965-52c6-4487-92af-739379b659ac">
+      <Terms xmlns="http://schemas.microsoft.com/office/infopath/2007/PartnerControls"/>
+    </lcf76f155ced4ddcb4097134ff3c332f>
+    <TaxCatchAll xmlns="e29f6279-0e28-4edd-8338-8230b9969525" xsi:nil="true"/>
+  </documentManagement>
+</p:properties>
 </file>
 
 <file path=customXml/itemProps1.xml><?xml version="1.0" encoding="utf-8"?>
-<ds:datastoreItem xmlns:ds="http://schemas.openxmlformats.org/officeDocument/2006/customXml" ds:itemID="{BBEB0EAC-C44A-4C2E-BCBF-069930B6BCF6}">
+<ds:datastoreItem xmlns:ds="http://schemas.openxmlformats.org/officeDocument/2006/customXml" ds:itemID="{F4C647C5-8FE0-424A-94FD-C65D3CDA80F4}">
   <ds:schemaRefs>
-    <ds:schemaRef ds:uri="http://schemas.microsoft.com/office/2006/metadata/properties"/>
-    <ds:schemaRef ds:uri="http://schemas.microsoft.com/office/infopath/2007/PartnerControls"/>
-    <ds:schemaRef ds:uri="3dd1c965-52c6-4487-92af-739379b659ac"/>
-    <ds:schemaRef ds:uri="e29f6279-0e28-4edd-8338-8230b9969525"/>
+    <ds:schemaRef ds:uri="http://schemas.microsoft.com/sharepoint/v3/contenttype/forms"/>
   </ds:schemaRefs>
 </ds:datastoreItem>
 </file>
@@ -5027,9 +5050,12 @@
 </file>
 
 <file path=customXml/itemProps3.xml><?xml version="1.0" encoding="utf-8"?>
-<ds:datastoreItem xmlns:ds="http://schemas.openxmlformats.org/officeDocument/2006/customXml" ds:itemID="{F4C647C5-8FE0-424A-94FD-C65D3CDA80F4}">
+<ds:datastoreItem xmlns:ds="http://schemas.openxmlformats.org/officeDocument/2006/customXml" ds:itemID="{BBEB0EAC-C44A-4C2E-BCBF-069930B6BCF6}">
   <ds:schemaRefs>
-    <ds:schemaRef ds:uri="http://schemas.microsoft.com/sharepoint/v3/contenttype/forms"/>
+    <ds:schemaRef ds:uri="http://schemas.microsoft.com/office/2006/metadata/properties"/>
+    <ds:schemaRef ds:uri="http://schemas.microsoft.com/office/infopath/2007/PartnerControls"/>
+    <ds:schemaRef ds:uri="3dd1c965-52c6-4487-92af-739379b659ac"/>
+    <ds:schemaRef ds:uri="e29f6279-0e28-4edd-8338-8230b9969525"/>
   </ds:schemaRefs>
 </ds:datastoreItem>
 </file>

</xml_diff>